<commit_message>
New database v2: welding_setup & parameters populated, gun auto-fill fixed
Database update (BD-20260515):
- welding_setup: 0 → 13796 rows (spot→gun→parameter links now complete)
- parameters: 0 → 547 rows (welding params with mode A/B)
- gun_transformer_assignment: fixed table name (2 s not 3)
- New SQL scripts for GWM A01/P01, Changan, Trans BS, Gun insert

Backend:
- GET /api/spots/:id/gun-info now returns exact gun+transformer+station+params
  via welding_setup JOIN chain (falls back to brand-filter if no setup found)
- GET /api/guns?brand_id= includes transformer+station details

Frontend DefectsPage:
- Spot select → auto-fills gun exactly from welding_setup
- SpotInfoCard shows welding params (pressure, current, mode, turn_R)
- Falls back to brand-filtered gun list if welding_setup has no entry

Co-Authored-By: Claude Sonnet 4.6 <noreply@anthropic.com>
</commit_message>
<xml_diff>
--- a/BD/scenario.docx
+++ b/BD/scenario.docx
@@ -6,12 +6,16 @@
       <w:pPr>
         <w:jc w:val="center"/>
         <w:rPr>
+          <w:b w:val="1"/>
+          <w:bCs w:val="1"/>
           <w:sz w:val="36"/>
           <w:szCs w:val="36"/>
         </w:rPr>
       </w:pPr>
       <w:r>
         <w:rPr>
+          <w:b w:val="1"/>
+          <w:bCs w:val="1"/>
           <w:sz w:val="36"/>
           <w:szCs w:val="36"/>
           <w:rtl w:val="0"/>
@@ -28,14 +32,543 @@
         <w:ind w:left="720" w:hanging="360"/>
         <w:jc w:val="left"/>
         <w:rPr>
-          <w:u w:val="none"/>
-        </w:rPr>
-      </w:pPr>
-      <w:r>
-        <w:rPr>
-          <w:rtl w:val="0"/>
-        </w:rPr>
-        <w:t xml:space="preserve">Создание новой точки на гане</w:t>
+          <w:b w:val="1"/>
+          <w:bCs w:val="1"/>
+        </w:rPr>
+      </w:pPr>
+      <w:r>
+        <w:rPr>
+          <w:b w:val="1"/>
+          <w:bCs w:val="1"/>
+          <w:rtl w:val="0"/>
+        </w:rPr>
+        <w:t xml:space="preserve">Создание новой точки на гане, которая не существовала до этого нигде </w:t>
+      </w:r>
+    </w:p>
+    <w:p>
+      <w:pPr>
+        <w:ind w:left="0" w:firstLine="0"/>
+        <w:jc w:val="left"/>
+        <w:rPr/>
+      </w:pPr>
+      <w:r>
+        <w:rPr>
+          <w:rtl w:val="0"/>
+        </w:rPr>
+      </w:r>
+    </w:p>
+    <w:p>
+      <w:pPr>
+        <w:rPr/>
+      </w:pPr>
+      <w:r>
+        <w:rPr>
+          <w:rtl w:val="0"/>
+        </w:rPr>
+        <w:t xml:space="preserve">BEGIN TRANSACTION;</w:t>
+      </w:r>
+    </w:p>
+    <w:p>
+      <w:pPr>
+        <w:rPr/>
+      </w:pPr>
+      <w:r>
+        <w:rPr>
+          <w:rtl w:val="0"/>
+        </w:rPr>
+      </w:r>
+    </w:p>
+    <w:p>
+      <w:pPr>
+        <w:rPr/>
+      </w:pPr>
+      <w:r>
+        <w:rPr>
+          <w:rtl w:val="0"/>
+        </w:rPr>
+        <w:t xml:space="preserve">-- Шаг 1: Создаем новую точку в таблице spot.</w:t>
+      </w:r>
+    </w:p>
+    <w:p>
+      <w:pPr>
+        <w:rPr/>
+      </w:pPr>
+      <w:r>
+        <w:rPr>
+          <w:rtl w:val="0"/>
+        </w:rPr>
+        <w:t xml:space="preserve">-- Указываем конкретный INTEGER идентификатор (например, 105).</w:t>
+      </w:r>
+    </w:p>
+    <w:p>
+      <w:pPr>
+        <w:rPr/>
+      </w:pPr>
+      <w:r>
+        <w:rPr>
+          <w:rtl w:val="0"/>
+        </w:rPr>
+        <w:t xml:space="preserve">-- Если в таблице есть другие поля (например, координаты X, Y, Z или код детали), их тоже нужно добавить сюда.</w:t>
+      </w:r>
+    </w:p>
+    <w:p>
+      <w:pPr>
+        <w:rPr/>
+      </w:pPr>
+      <w:r>
+        <w:rPr>
+          <w:rtl w:val="0"/>
+        </w:rPr>
+        <w:t xml:space="preserve">INSERT INTO spot (</w:t>
+      </w:r>
+    </w:p>
+    <w:p>
+      <w:pPr>
+        <w:rPr/>
+      </w:pPr>
+      <w:r>
+        <w:rPr>
+          <w:rtl w:val="0"/>
+        </w:rPr>
+        <w:t xml:space="preserve">    spot_id,</w:t>
+      </w:r>
+    </w:p>
+    <w:p>
+      <w:pPr>
+        <w:rPr/>
+      </w:pPr>
+      <w:r>
+        <w:rPr>
+          <w:rtl w:val="0"/>
+        </w:rPr>
+        <w:t xml:space="preserve">    model_id</w:t>
+      </w:r>
+    </w:p>
+    <w:p>
+      <w:pPr>
+        <w:rPr/>
+      </w:pPr>
+      <w:r>
+        <w:rPr>
+          <w:rtl w:val="0"/>
+        </w:rPr>
+        <w:t xml:space="preserve">    ) </w:t>
+      </w:r>
+    </w:p>
+    <w:p>
+      <w:pPr>
+        <w:rPr/>
+      </w:pPr>
+      <w:r>
+        <w:rPr>
+          <w:rtl w:val="0"/>
+        </w:rPr>
+        <w:t xml:space="preserve">VALUES (</w:t>
+      </w:r>
+    </w:p>
+    <w:p>
+      <w:pPr>
+        <w:rPr/>
+      </w:pPr>
+      <w:r>
+        <w:rPr>
+          <w:rtl w:val="0"/>
+        </w:rPr>
+        <w:t xml:space="preserve">    105,</w:t>
+      </w:r>
+    </w:p>
+    <w:p>
+      <w:pPr>
+        <w:rPr/>
+      </w:pPr>
+      <w:r>
+        <w:rPr>
+          <w:rtl w:val="0"/>
+        </w:rPr>
+        <w:t xml:space="preserve">    1);</w:t>
+      </w:r>
+    </w:p>
+    <w:p>
+      <w:pPr>
+        <w:rPr/>
+      </w:pPr>
+      <w:r>
+        <w:rPr>
+          <w:rtl w:val="0"/>
+        </w:rPr>
+      </w:r>
+    </w:p>
+    <w:p>
+      <w:pPr>
+        <w:rPr/>
+      </w:pPr>
+      <w:r>
+        <w:rPr>
+          <w:rtl w:val="0"/>
+        </w:rPr>
+        <w:t xml:space="preserve">-- Шаг 2: Задаем физические параметры для сварки этой точки.</w:t>
+      </w:r>
+    </w:p>
+    <w:p>
+      <w:pPr>
+        <w:rPr/>
+      </w:pPr>
+      <w:r>
+        <w:rPr>
+          <w:rtl w:val="0"/>
+        </w:rPr>
+        <w:t xml:space="preserve">INSERT INTO parameters (</w:t>
+      </w:r>
+    </w:p>
+    <w:p>
+      <w:pPr>
+        <w:rPr/>
+      </w:pPr>
+      <w:r>
+        <w:rPr>
+          <w:rtl w:val="0"/>
+        </w:rPr>
+        <w:t xml:space="preserve">    pressure, </w:t>
+      </w:r>
+    </w:p>
+    <w:p>
+      <w:pPr>
+        <w:rPr/>
+      </w:pPr>
+      <w:r>
+        <w:rPr>
+          <w:rtl w:val="0"/>
+        </w:rPr>
+        <w:t xml:space="preserve">    squeeze_time, </w:t>
+      </w:r>
+    </w:p>
+    <w:p>
+      <w:pPr>
+        <w:rPr/>
+      </w:pPr>
+      <w:r>
+        <w:rPr>
+          <w:rtl w:val="0"/>
+        </w:rPr>
+        <w:t xml:space="preserve">    weld_time, </w:t>
+      </w:r>
+    </w:p>
+    <w:p>
+      <w:pPr>
+        <w:rPr/>
+      </w:pPr>
+      <w:r>
+        <w:rPr>
+          <w:rtl w:val="0"/>
+        </w:rPr>
+        <w:t xml:space="preserve">    cool_time, </w:t>
+      </w:r>
+    </w:p>
+    <w:p>
+      <w:pPr>
+        <w:rPr/>
+      </w:pPr>
+      <w:r>
+        <w:rPr>
+          <w:rtl w:val="0"/>
+        </w:rPr>
+        <w:t xml:space="preserve">    hold_time</w:t>
+      </w:r>
+    </w:p>
+    <w:p>
+      <w:pPr>
+        <w:rPr/>
+      </w:pPr>
+      <w:r>
+        <w:rPr>
+          <w:rtl w:val="0"/>
+        </w:rPr>
+        <w:t xml:space="preserve">) </w:t>
+      </w:r>
+    </w:p>
+    <w:p>
+      <w:pPr>
+        <w:rPr/>
+      </w:pPr>
+      <w:r>
+        <w:rPr>
+          <w:rtl w:val="0"/>
+        </w:rPr>
+        <w:t xml:space="preserve">VALUES (</w:t>
+      </w:r>
+    </w:p>
+    <w:p>
+      <w:pPr>
+        <w:rPr/>
+      </w:pPr>
+      <w:r>
+        <w:rPr>
+          <w:rtl w:val="0"/>
+        </w:rPr>
+        <w:t xml:space="preserve">    2.5, </w:t>
+      </w:r>
+    </w:p>
+    <w:p>
+      <w:pPr>
+        <w:rPr/>
+      </w:pPr>
+      <w:r>
+        <w:rPr>
+          <w:rtl w:val="0"/>
+        </w:rPr>
+        <w:t xml:space="preserve">    15, </w:t>
+      </w:r>
+    </w:p>
+    <w:p>
+      <w:pPr>
+        <w:rPr/>
+      </w:pPr>
+      <w:r>
+        <w:rPr>
+          <w:rtl w:val="0"/>
+        </w:rPr>
+        <w:t xml:space="preserve">    12, </w:t>
+      </w:r>
+    </w:p>
+    <w:p>
+      <w:pPr>
+        <w:rPr/>
+      </w:pPr>
+      <w:r>
+        <w:rPr>
+          <w:rtl w:val="0"/>
+        </w:rPr>
+        <w:t xml:space="preserve">    2, </w:t>
+      </w:r>
+    </w:p>
+    <w:p>
+      <w:pPr>
+        <w:rPr/>
+      </w:pPr>
+      <w:r>
+        <w:rPr>
+          <w:rtl w:val="0"/>
+        </w:rPr>
+        <w:t xml:space="preserve">    5</w:t>
+      </w:r>
+    </w:p>
+    <w:p>
+      <w:pPr>
+        <w:rPr/>
+      </w:pPr>
+      <w:r>
+        <w:rPr>
+          <w:rtl w:val="0"/>
+        </w:rPr>
+        <w:t xml:space="preserve">);</w:t>
+      </w:r>
+    </w:p>
+    <w:p>
+      <w:pPr>
+        <w:rPr/>
+      </w:pPr>
+      <w:r>
+        <w:rPr>
+          <w:rtl w:val="0"/>
+        </w:rPr>
+      </w:r>
+    </w:p>
+    <w:p>
+      <w:pPr>
+        <w:rPr/>
+      </w:pPr>
+      <w:r>
+        <w:rPr>
+          <w:rtl w:val="0"/>
+        </w:rPr>
+        <w:t xml:space="preserve">-- Шаг 3: Создаем настройку в welding_setup, объединяя точку, клещи и параметры.</w:t>
+      </w:r>
+    </w:p>
+    <w:p>
+      <w:pPr>
+        <w:rPr/>
+      </w:pPr>
+      <w:r>
+        <w:rPr>
+          <w:rtl w:val="0"/>
+        </w:rPr>
+        <w:t xml:space="preserve">INSERT INTO welding_setup (</w:t>
+      </w:r>
+    </w:p>
+    <w:p>
+      <w:pPr>
+        <w:rPr/>
+      </w:pPr>
+      <w:r>
+        <w:rPr>
+          <w:rtl w:val="0"/>
+        </w:rPr>
+        <w:t xml:space="preserve">    spot_id, </w:t>
+      </w:r>
+    </w:p>
+    <w:p>
+      <w:pPr>
+        <w:rPr/>
+      </w:pPr>
+      <w:r>
+        <w:rPr>
+          <w:rtl w:val="0"/>
+        </w:rPr>
+        <w:t xml:space="preserve">    gun_id, </w:t>
+      </w:r>
+    </w:p>
+    <w:p>
+      <w:pPr>
+        <w:rPr/>
+      </w:pPr>
+      <w:r>
+        <w:rPr>
+          <w:rtl w:val="0"/>
+        </w:rPr>
+        <w:t xml:space="preserve">    parameter_id, </w:t>
+      </w:r>
+    </w:p>
+    <w:p>
+      <w:pPr>
+        <w:rPr/>
+      </w:pPr>
+      <w:r>
+        <w:rPr>
+          <w:rtl w:val="0"/>
+        </w:rPr>
+        <w:t xml:space="preserve">    start_date, </w:t>
+      </w:r>
+    </w:p>
+    <w:p>
+      <w:pPr>
+        <w:rPr/>
+      </w:pPr>
+      <w:r>
+        <w:rPr>
+          <w:rtl w:val="0"/>
+        </w:rPr>
+        <w:t xml:space="preserve">    is_active </w:t>
+      </w:r>
+    </w:p>
+    <w:p>
+      <w:pPr>
+        <w:rPr/>
+      </w:pPr>
+      <w:r>
+        <w:rPr>
+          <w:rtl w:val="0"/>
+        </w:rPr>
+        <w:t xml:space="preserve">) </w:t>
+      </w:r>
+    </w:p>
+    <w:p>
+      <w:pPr>
+        <w:rPr/>
+      </w:pPr>
+      <w:r>
+        <w:rPr>
+          <w:rtl w:val="0"/>
+        </w:rPr>
+        <w:t xml:space="preserve">VALUES (</w:t>
+      </w:r>
+    </w:p>
+    <w:p>
+      <w:pPr>
+        <w:rPr/>
+      </w:pPr>
+      <w:r>
+        <w:rPr>
+          <w:rtl w:val="0"/>
+        </w:rPr>
+        <w:t xml:space="preserve">    105,                  -- Тот же INTEGER ID точки, который мы использовали на Шаге 1</w:t>
+      </w:r>
+    </w:p>
+    <w:p>
+      <w:pPr>
+        <w:rPr/>
+      </w:pPr>
+      <w:r>
+        <w:rPr>
+          <w:rtl w:val="0"/>
+        </w:rPr>
+        <w:t xml:space="preserve">    3,                    -- ID сварочных клещей</w:t>
+      </w:r>
+    </w:p>
+    <w:p>
+      <w:pPr>
+        <w:rPr/>
+      </w:pPr>
+      <w:r>
+        <w:rPr>
+          <w:rtl w:val="0"/>
+        </w:rPr>
+        <w:t xml:space="preserve">    last_insert_rowid()   -- Подхватывает ID из таблицы parameters, так как это был последний INSERT</w:t>
+      </w:r>
+    </w:p>
+    <w:p>
+      <w:pPr>
+        <w:rPr/>
+      </w:pPr>
+      <w:r>
+        <w:rPr>
+          <w:rtl w:val="0"/>
+        </w:rPr>
+        <w:t xml:space="preserve">    '2026-05-14', -- Текущая дата начала эксплуатации точки </w:t>
+      </w:r>
+    </w:p>
+    <w:p>
+      <w:pPr>
+        <w:rPr/>
+      </w:pPr>
+      <w:r>
+        <w:rPr>
+          <w:rtl w:val="0"/>
+        </w:rPr>
+        <w:t xml:space="preserve">    1 -- Статус (1 = активна) </w:t>
+      </w:r>
+    </w:p>
+    <w:p>
+      <w:pPr>
+        <w:rPr/>
+      </w:pPr>
+      <w:r>
+        <w:rPr>
+          <w:rtl w:val="0"/>
+        </w:rPr>
+        <w:t xml:space="preserve">);</w:t>
+      </w:r>
+    </w:p>
+    <w:p>
+      <w:pPr>
+        <w:rPr/>
+      </w:pPr>
+      <w:r>
+        <w:rPr>
+          <w:rtl w:val="0"/>
+        </w:rPr>
+      </w:r>
+    </w:p>
+    <w:p>
+      <w:pPr>
+        <w:rPr/>
+      </w:pPr>
+      <w:r>
+        <w:rPr>
+          <w:rtl w:val="0"/>
+        </w:rPr>
+        <w:t xml:space="preserve">COMMIT;</w:t>
+      </w:r>
+    </w:p>
+    <w:p>
+      <w:pPr>
+        <w:ind w:left="0" w:firstLine="0"/>
+        <w:jc w:val="left"/>
+        <w:rPr/>
+      </w:pPr>
+      <w:r>
+        <w:rPr>
+          <w:rtl w:val="0"/>
+        </w:rPr>
       </w:r>
     </w:p>
     <w:p>
@@ -47,14 +580,286 @@
         <w:ind w:left="720" w:hanging="360"/>
         <w:jc w:val="left"/>
         <w:rPr>
-          <w:u w:val="none"/>
-        </w:rPr>
-      </w:pPr>
-      <w:r>
-        <w:rPr>
+          <w:b w:val="1"/>
+          <w:bCs w:val="1"/>
+        </w:rPr>
+      </w:pPr>
+      <w:r>
+        <w:rPr>
+          <w:b w:val="1"/>
+          <w:bCs w:val="1"/>
           <w:rtl w:val="0"/>
         </w:rPr>
         <w:t xml:space="preserve">Перенос точки с одного гана на другой</w:t>
+      </w:r>
+    </w:p>
+    <w:p>
+      <w:pPr>
+        <w:ind w:left="0" w:firstLine="0"/>
+        <w:jc w:val="left"/>
+        <w:rPr>
+          <w:b w:val="1"/>
+          <w:bCs w:val="1"/>
+        </w:rPr>
+      </w:pPr>
+      <w:r>
+        <w:rPr>
+          <w:rtl w:val="0"/>
+        </w:rPr>
+      </w:r>
+    </w:p>
+    <w:p>
+      <w:pPr>
+        <w:rPr/>
+      </w:pPr>
+      <w:r>
+        <w:rPr>
+          <w:rtl w:val="0"/>
+        </w:rPr>
+        <w:t xml:space="preserve">BEGIN TRANSACTION;</w:t>
+      </w:r>
+    </w:p>
+    <w:p>
+      <w:pPr>
+        <w:rPr/>
+      </w:pPr>
+      <w:r>
+        <w:rPr>
+          <w:rtl w:val="0"/>
+        </w:rPr>
+      </w:r>
+    </w:p>
+    <w:p>
+      <w:pPr>
+        <w:rPr/>
+      </w:pPr>
+      <w:r>
+        <w:rPr>
+          <w:rtl w:val="0"/>
+        </w:rPr>
+        <w:t xml:space="preserve">-- Шаг 1: Создаем новую привязку для точки на НОВЫХ клещах (gun_id = 5).</w:t>
+      </w:r>
+    </w:p>
+    <w:p>
+      <w:pPr>
+        <w:rPr/>
+      </w:pPr>
+      <w:r>
+        <w:rPr>
+          <w:rtl w:val="0"/>
+        </w:rPr>
+        <w:t xml:space="preserve">-- Мы используем SELECT, чтобы автоматически скопировать ID параметров из текущей активной записи.</w:t>
+      </w:r>
+    </w:p>
+    <w:p>
+      <w:pPr>
+        <w:rPr/>
+      </w:pPr>
+      <w:r>
+        <w:rPr>
+          <w:rtl w:val="0"/>
+        </w:rPr>
+        <w:t xml:space="preserve">INSERT INTO welding_setup (spot_id, gun_id, parameter_id, start_date, is_active)</w:t>
+      </w:r>
+    </w:p>
+    <w:p>
+      <w:pPr>
+        <w:rPr/>
+      </w:pPr>
+      <w:r>
+        <w:rPr>
+          <w:rtl w:val="0"/>
+        </w:rPr>
+        <w:t xml:space="preserve">SELECT </w:t>
+      </w:r>
+    </w:p>
+    <w:p>
+      <w:pPr>
+        <w:rPr/>
+      </w:pPr>
+      <w:r>
+        <w:rPr>
+          <w:rtl w:val="0"/>
+        </w:rPr>
+        <w:t xml:space="preserve">    spot_id, </w:t>
+      </w:r>
+    </w:p>
+    <w:p>
+      <w:pPr>
+        <w:rPr/>
+      </w:pPr>
+      <w:r>
+        <w:rPr>
+          <w:rtl w:val="0"/>
+        </w:rPr>
+        <w:t xml:space="preserve">    5,              -- ID новых клещей, на которые переносим</w:t>
+      </w:r>
+    </w:p>
+    <w:p>
+      <w:pPr>
+        <w:rPr/>
+      </w:pPr>
+      <w:r>
+        <w:rPr>
+          <w:rtl w:val="0"/>
+        </w:rPr>
+        <w:t xml:space="preserve">    parameter_id,   -- Копируем текущий рабочий режим</w:t>
+      </w:r>
+    </w:p>
+    <w:p>
+      <w:pPr>
+        <w:rPr/>
+      </w:pPr>
+      <w:r>
+        <w:rPr>
+          <w:rtl w:val="0"/>
+        </w:rPr>
+        <w:t xml:space="preserve">    '2026-05-14',   -- Дата переноса (сегодняшняя)</w:t>
+      </w:r>
+    </w:p>
+    <w:p>
+      <w:pPr>
+        <w:rPr/>
+      </w:pPr>
+      <w:r>
+        <w:rPr>
+          <w:rtl w:val="0"/>
+        </w:rPr>
+        <w:t xml:space="preserve">    1               -- Статус: активна</w:t>
+      </w:r>
+    </w:p>
+    <w:p>
+      <w:pPr>
+        <w:rPr/>
+      </w:pPr>
+      <w:r>
+        <w:rPr>
+          <w:rtl w:val="0"/>
+        </w:rPr>
+        <w:t xml:space="preserve">FROM welding_setup </w:t>
+      </w:r>
+    </w:p>
+    <w:p>
+      <w:pPr>
+        <w:rPr/>
+      </w:pPr>
+      <w:r>
+        <w:rPr>
+          <w:rtl w:val="0"/>
+        </w:rPr>
+        <w:t xml:space="preserve">WHERE spot_id = 105 AND is_active = 1 AND gun_id = 3;</w:t>
+      </w:r>
+    </w:p>
+    <w:p>
+      <w:pPr>
+        <w:rPr/>
+      </w:pPr>
+      <w:r>
+        <w:rPr>
+          <w:rtl w:val="0"/>
+        </w:rPr>
+      </w:r>
+    </w:p>
+    <w:p>
+      <w:pPr>
+        <w:rPr/>
+      </w:pPr>
+      <w:r>
+        <w:rPr>
+          <w:rtl w:val="0"/>
+        </w:rPr>
+        <w:t xml:space="preserve">-- Шаг 2: "Закрываем" старую привязку на СТАРЫХ клещах (gun_id = 3).</w:t>
+      </w:r>
+    </w:p>
+    <w:p>
+      <w:pPr>
+        <w:rPr/>
+      </w:pPr>
+      <w:r>
+        <w:rPr>
+          <w:rtl w:val="0"/>
+        </w:rPr>
+        <w:t xml:space="preserve">-- Обратите внимание: мы делаем это после INSERT, чтобы на Шаге 1 сработал поиск по is_active = 1.</w:t>
+      </w:r>
+    </w:p>
+    <w:p>
+      <w:pPr>
+        <w:rPr/>
+      </w:pPr>
+      <w:r>
+        <w:rPr>
+          <w:rtl w:val="0"/>
+        </w:rPr>
+        <w:t xml:space="preserve">UPDATE welding_setup</w:t>
+      </w:r>
+    </w:p>
+    <w:p>
+      <w:pPr>
+        <w:rPr/>
+      </w:pPr>
+      <w:r>
+        <w:rPr>
+          <w:rtl w:val="0"/>
+        </w:rPr>
+        <w:t xml:space="preserve">SET is_active = 0,</w:t>
+      </w:r>
+    </w:p>
+    <w:p>
+      <w:pPr>
+        <w:rPr/>
+      </w:pPr>
+      <w:r>
+        <w:rPr>
+          <w:rtl w:val="0"/>
+        </w:rPr>
+        <w:t xml:space="preserve">    end_date = '2026-05-14' -- Если добавите столбец end_date, фиксируем дату снятия</w:t>
+      </w:r>
+    </w:p>
+    <w:p>
+      <w:pPr>
+        <w:rPr/>
+      </w:pPr>
+      <w:r>
+        <w:rPr>
+          <w:rtl w:val="0"/>
+        </w:rPr>
+        <w:t xml:space="preserve">WHERE spot_id = 105 AND gun_id = 3 AND is_active = 1;</w:t>
+      </w:r>
+    </w:p>
+    <w:p>
+      <w:pPr>
+        <w:rPr/>
+      </w:pPr>
+      <w:r>
+        <w:rPr>
+          <w:rtl w:val="0"/>
+        </w:rPr>
+      </w:r>
+    </w:p>
+    <w:p>
+      <w:pPr>
+        <w:rPr/>
+      </w:pPr>
+      <w:r>
+        <w:rPr>
+          <w:rtl w:val="0"/>
+        </w:rPr>
+        <w:t xml:space="preserve">COMMIT;</w:t>
+      </w:r>
+    </w:p>
+    <w:p>
+      <w:pPr>
+        <w:ind w:left="0" w:firstLine="0"/>
+        <w:jc w:val="left"/>
+        <w:rPr>
+          <w:b w:val="1"/>
+          <w:bCs w:val="1"/>
+        </w:rPr>
+      </w:pPr>
+      <w:r>
+        <w:rPr>
+          <w:rtl w:val="0"/>
+        </w:rPr>
       </w:r>
     </w:p>
     <w:p>
@@ -66,11 +871,14 @@
         <w:ind w:left="720" w:hanging="360"/>
         <w:jc w:val="left"/>
         <w:rPr>
-          <w:u w:val="none"/>
-        </w:rPr>
-      </w:pPr>
-      <w:r>
-        <w:rPr>
+          <w:b w:val="1"/>
+          <w:bCs w:val="1"/>
+        </w:rPr>
+      </w:pPr>
+      <w:r>
+        <w:rPr>
+          <w:b w:val="1"/>
+          <w:bCs w:val="1"/>
           <w:rtl w:val="0"/>
         </w:rPr>
         <w:t xml:space="preserve">Присвоение нового параметра точке (на старой строке welding_setup изменение comments и is_active)</w:t>
@@ -78,9 +886,492 @@
     </w:p>
     <w:p>
       <w:pPr>
-        <w:ind w:left="720" w:firstLine="0"/>
-        <w:jc w:val="center"/>
-        <w:rPr/>
+        <w:rPr/>
+      </w:pPr>
+      <w:r>
+        <w:rPr>
+          <w:rtl w:val="0"/>
+        </w:rPr>
+        <w:t xml:space="preserve">BEGIN TRANSACTION;</w:t>
+      </w:r>
+    </w:p>
+    <w:p>
+      <w:pPr>
+        <w:rPr/>
+      </w:pPr>
+      <w:r>
+        <w:rPr>
+          <w:rtl w:val="0"/>
+        </w:rPr>
+      </w:r>
+    </w:p>
+    <w:p>
+      <w:pPr>
+        <w:rPr/>
+      </w:pPr>
+      <w:r>
+        <w:rPr>
+          <w:rtl w:val="0"/>
+        </w:rPr>
+        <w:t xml:space="preserve">-- Шаг 1: Создаем абсолютно новый, индивидуальный набор параметров.</w:t>
+      </w:r>
+    </w:p>
+    <w:p>
+      <w:pPr>
+        <w:rPr/>
+      </w:pPr>
+      <w:r>
+        <w:rPr>
+          <w:rtl w:val="0"/>
+        </w:rPr>
+        <w:t xml:space="preserve">-- Мы точно знаем, что этот ID пока не привязан ни к одной другой точке.</w:t>
+      </w:r>
+    </w:p>
+    <w:p>
+      <w:pPr>
+        <w:rPr/>
+      </w:pPr>
+      <w:r>
+        <w:rPr>
+          <w:rtl w:val="0"/>
+        </w:rPr>
+        <w:t xml:space="preserve">INSERT INTO parameters (</w:t>
+      </w:r>
+    </w:p>
+    <w:p>
+      <w:pPr>
+        <w:rPr/>
+      </w:pPr>
+      <w:r>
+        <w:rPr>
+          <w:rtl w:val="0"/>
+        </w:rPr>
+        <w:t xml:space="preserve">    pressure, </w:t>
+      </w:r>
+    </w:p>
+    <w:p>
+      <w:pPr>
+        <w:rPr/>
+      </w:pPr>
+      <w:r>
+        <w:rPr>
+          <w:rtl w:val="0"/>
+        </w:rPr>
+        <w:t xml:space="preserve">    squeeze_time, </w:t>
+      </w:r>
+    </w:p>
+    <w:p>
+      <w:pPr>
+        <w:rPr/>
+      </w:pPr>
+      <w:r>
+        <w:rPr>
+          <w:rtl w:val="0"/>
+        </w:rPr>
+        <w:t xml:space="preserve">    weld_time, </w:t>
+      </w:r>
+    </w:p>
+    <w:p>
+      <w:pPr>
+        <w:rPr/>
+      </w:pPr>
+      <w:r>
+        <w:rPr>
+          <w:rtl w:val="0"/>
+        </w:rPr>
+        <w:t xml:space="preserve">    cool_time, </w:t>
+      </w:r>
+    </w:p>
+    <w:p>
+      <w:pPr>
+        <w:rPr/>
+      </w:pPr>
+      <w:r>
+        <w:rPr>
+          <w:rtl w:val="0"/>
+        </w:rPr>
+        <w:t xml:space="preserve">    hold_time</w:t>
+      </w:r>
+    </w:p>
+    <w:p>
+      <w:pPr>
+        <w:rPr/>
+      </w:pPr>
+      <w:r>
+        <w:rPr>
+          <w:rtl w:val="0"/>
+        </w:rPr>
+        <w:t xml:space="preserve">) </w:t>
+      </w:r>
+    </w:p>
+    <w:p>
+      <w:pPr>
+        <w:rPr/>
+      </w:pPr>
+      <w:r>
+        <w:rPr>
+          <w:rtl w:val="0"/>
+        </w:rPr>
+        <w:t xml:space="preserve">VALUES (</w:t>
+      </w:r>
+    </w:p>
+    <w:p>
+      <w:pPr>
+        <w:rPr/>
+      </w:pPr>
+      <w:r>
+        <w:rPr>
+          <w:rtl w:val="0"/>
+        </w:rPr>
+        <w:t xml:space="preserve">    2.8,  -- Например, слегка увеличили давление</w:t>
+      </w:r>
+    </w:p>
+    <w:p>
+      <w:pPr>
+        <w:rPr/>
+      </w:pPr>
+      <w:r>
+        <w:rPr>
+          <w:rtl w:val="0"/>
+        </w:rPr>
+        <w:t xml:space="preserve">    15, </w:t>
+      </w:r>
+    </w:p>
+    <w:p>
+      <w:pPr>
+        <w:rPr/>
+      </w:pPr>
+      <w:r>
+        <w:rPr>
+          <w:rtl w:val="0"/>
+        </w:rPr>
+        <w:t xml:space="preserve">    14,   -- И добавили время сварки</w:t>
+      </w:r>
+    </w:p>
+    <w:p>
+      <w:pPr>
+        <w:rPr/>
+      </w:pPr>
+      <w:r>
+        <w:rPr>
+          <w:rtl w:val="0"/>
+        </w:rPr>
+        <w:t xml:space="preserve">    2, </w:t>
+      </w:r>
+    </w:p>
+    <w:p>
+      <w:pPr>
+        <w:rPr/>
+      </w:pPr>
+      <w:r>
+        <w:rPr>
+          <w:rtl w:val="0"/>
+        </w:rPr>
+        <w:t xml:space="preserve">    5</w:t>
+      </w:r>
+    </w:p>
+    <w:p>
+      <w:pPr>
+        <w:rPr/>
+      </w:pPr>
+      <w:r>
+        <w:rPr>
+          <w:rtl w:val="0"/>
+        </w:rPr>
+        <w:t xml:space="preserve">);</w:t>
+      </w:r>
+    </w:p>
+    <w:p>
+      <w:pPr>
+        <w:rPr/>
+      </w:pPr>
+      <w:r>
+        <w:rPr>
+          <w:rtl w:val="0"/>
+        </w:rPr>
+      </w:r>
+    </w:p>
+    <w:p>
+      <w:pPr>
+        <w:rPr/>
+      </w:pPr>
+      <w:r>
+        <w:rPr>
+          <w:rtl w:val="0"/>
+        </w:rPr>
+        <w:t xml:space="preserve">-- Шаг 2: Создаем новую активную привязку в welding_setup.</w:t>
+      </w:r>
+    </w:p>
+    <w:p>
+      <w:pPr>
+        <w:rPr/>
+      </w:pPr>
+      <w:r>
+        <w:rPr>
+          <w:rtl w:val="0"/>
+        </w:rPr>
+        <w:t xml:space="preserve">-- Клещи (gun_id) автоматически подтянутся от старой записи.</w:t>
+      </w:r>
+    </w:p>
+    <w:p>
+      <w:pPr>
+        <w:rPr/>
+      </w:pPr>
+      <w:r>
+        <w:rPr>
+          <w:rtl w:val="0"/>
+        </w:rPr>
+        <w:t xml:space="preserve">INSERT INTO welding_setup (spot_id, gun_id, parameter_id, start_date, is_active, comments)</w:t>
+      </w:r>
+    </w:p>
+    <w:p>
+      <w:pPr>
+        <w:rPr/>
+      </w:pPr>
+      <w:r>
+        <w:rPr>
+          <w:rtl w:val="0"/>
+        </w:rPr>
+        <w:t xml:space="preserve">SELECT </w:t>
+      </w:r>
+    </w:p>
+    <w:p>
+      <w:pPr>
+        <w:rPr/>
+      </w:pPr>
+      <w:r>
+        <w:rPr>
+          <w:rtl w:val="0"/>
+        </w:rPr>
+        <w:t xml:space="preserve">    spot_id, </w:t>
+      </w:r>
+    </w:p>
+    <w:p>
+      <w:pPr>
+        <w:rPr/>
+      </w:pPr>
+      <w:r>
+        <w:rPr>
+          <w:rtl w:val="0"/>
+        </w:rPr>
+        <w:t xml:space="preserve">    gun_id, </w:t>
+      </w:r>
+    </w:p>
+    <w:p>
+      <w:pPr>
+        <w:rPr/>
+      </w:pPr>
+      <w:r>
+        <w:rPr>
+          <w:rtl w:val="0"/>
+        </w:rPr>
+        <w:t xml:space="preserve">    last_insert_rowid(),  -- Подхватываем ID только что созданного параметра</w:t>
+      </w:r>
+    </w:p>
+    <w:p>
+      <w:pPr>
+        <w:rPr/>
+      </w:pPr>
+      <w:r>
+        <w:rPr>
+          <w:rtl w:val="0"/>
+        </w:rPr>
+        <w:t xml:space="preserve">    '2026-05-14', </w:t>
+      </w:r>
+    </w:p>
+    <w:p>
+      <w:pPr>
+        <w:rPr/>
+      </w:pPr>
+      <w:r>
+        <w:rPr>
+          <w:rtl w:val="0"/>
+        </w:rPr>
+        <w:t xml:space="preserve">    1, </w:t>
+      </w:r>
+    </w:p>
+    <w:p>
+      <w:pPr>
+        <w:rPr/>
+      </w:pPr>
+      <w:r>
+        <w:rPr>
+          <w:rtl w:val="0"/>
+        </w:rPr>
+        <w:t xml:space="preserve">    'Создан и применен новый индивидуальный параметр'</w:t>
+      </w:r>
+    </w:p>
+    <w:p>
+      <w:pPr>
+        <w:rPr/>
+      </w:pPr>
+      <w:r>
+        <w:rPr>
+          <w:rtl w:val="0"/>
+        </w:rPr>
+        <w:t xml:space="preserve">FROM welding_setup</w:t>
+      </w:r>
+    </w:p>
+    <w:p>
+      <w:pPr>
+        <w:rPr/>
+      </w:pPr>
+      <w:r>
+        <w:rPr>
+          <w:rtl w:val="0"/>
+        </w:rPr>
+        <w:t xml:space="preserve">WHERE spot_id = 105 AND is_active = 1;</w:t>
+      </w:r>
+    </w:p>
+    <w:p>
+      <w:pPr>
+        <w:rPr/>
+      </w:pPr>
+      <w:r>
+        <w:rPr>
+          <w:rtl w:val="0"/>
+        </w:rPr>
+      </w:r>
+    </w:p>
+    <w:p>
+      <w:pPr>
+        <w:rPr/>
+      </w:pPr>
+      <w:r>
+        <w:rPr>
+          <w:rtl w:val="0"/>
+        </w:rPr>
+        <w:t xml:space="preserve">-- Шаг 3: Отправляем старую запись в архив.</w:t>
+      </w:r>
+    </w:p>
+    <w:p>
+      <w:pPr>
+        <w:rPr/>
+      </w:pPr>
+      <w:r>
+        <w:rPr>
+          <w:rtl w:val="0"/>
+        </w:rPr>
+        <w:t xml:space="preserve">-- Чтобы база случайно не закрыла только что созданную на Шаге 2 строку,</w:t>
+      </w:r>
+    </w:p>
+    <w:p>
+      <w:pPr>
+        <w:rPr/>
+      </w:pPr>
+      <w:r>
+        <w:rPr>
+          <w:rtl w:val="0"/>
+        </w:rPr>
+        <w:t xml:space="preserve">-- мы отсекаем её с помощью условия (например, исключая новый комментарий).</w:t>
+      </w:r>
+    </w:p>
+    <w:p>
+      <w:pPr>
+        <w:rPr/>
+      </w:pPr>
+      <w:r>
+        <w:rPr>
+          <w:rtl w:val="0"/>
+        </w:rPr>
+        <w:t xml:space="preserve">UPDATE welding_setup</w:t>
+      </w:r>
+    </w:p>
+    <w:p>
+      <w:pPr>
+        <w:rPr/>
+      </w:pPr>
+      <w:r>
+        <w:rPr>
+          <w:rtl w:val="0"/>
+        </w:rPr>
+        <w:t xml:space="preserve">SET is_active = 0,</w:t>
+      </w:r>
+    </w:p>
+    <w:p>
+      <w:pPr>
+        <w:rPr/>
+      </w:pPr>
+      <w:r>
+        <w:rPr>
+          <w:rtl w:val="0"/>
+        </w:rPr>
+        <w:t xml:space="preserve">    end_date = '2026-05-14',</w:t>
+      </w:r>
+    </w:p>
+    <w:p>
+      <w:pPr>
+        <w:rPr/>
+      </w:pPr>
+      <w:r>
+        <w:rPr>
+          <w:rtl w:val="0"/>
+        </w:rPr>
+        <w:t xml:space="preserve">    comments = 'Устарело: параметры заменены на новую ревизию.'</w:t>
+      </w:r>
+    </w:p>
+    <w:p>
+      <w:pPr>
+        <w:rPr/>
+      </w:pPr>
+      <w:r>
+        <w:rPr>
+          <w:rtl w:val="0"/>
+        </w:rPr>
+        <w:t xml:space="preserve">WHERE spot_id = 105 </w:t>
+      </w:r>
+    </w:p>
+    <w:p>
+      <w:pPr>
+        <w:rPr/>
+      </w:pPr>
+      <w:r>
+        <w:rPr>
+          <w:rtl w:val="0"/>
+        </w:rPr>
+        <w:t xml:space="preserve">  AND is_active = 1 </w:t>
+      </w:r>
+    </w:p>
+    <w:p>
+      <w:pPr>
+        <w:rPr/>
+      </w:pPr>
+      <w:r>
+        <w:rPr>
+          <w:rtl w:val="0"/>
+        </w:rPr>
+        <w:t xml:space="preserve">  AND comments != 'Создан и применен новый индивидуальный параметр';</w:t>
+      </w:r>
+    </w:p>
+    <w:p>
+      <w:pPr>
+        <w:rPr/>
+      </w:pPr>
+      <w:r>
+        <w:rPr>
+          <w:rtl w:val="0"/>
+        </w:rPr>
+      </w:r>
+    </w:p>
+    <w:p>
+      <w:pPr>
+        <w:rPr/>
+      </w:pPr>
+      <w:r>
+        <w:rPr>
+          <w:rtl w:val="0"/>
+        </w:rPr>
+        <w:t xml:space="preserve">COMMIT;</w:t>
+      </w:r>
+    </w:p>
+    <w:p>
+      <w:pPr>
+        <w:ind w:left="0" w:firstLine="0"/>
+        <w:jc w:val="left"/>
+        <w:rPr>
+          <w:b w:val="1"/>
+          <w:bCs w:val="1"/>
+        </w:rPr>
       </w:pPr>
       <w:r>
         <w:rPr>
@@ -92,16 +1383,35 @@
       <w:pPr>
         <w:ind w:left="0" w:firstLine="0"/>
         <w:jc w:val="center"/>
-        <w:rPr/>
-      </w:pPr>
-      <w:r>
-        <w:rPr>
+        <w:rPr>
+          <w:b w:val="1"/>
+          <w:bCs w:val="1"/>
           <w:sz w:val="36"/>
           <w:szCs w:val="36"/>
+        </w:rPr>
+      </w:pPr>
+      <w:r>
+        <w:rPr>
+          <w:b w:val="1"/>
+          <w:bCs w:val="1"/>
+          <w:sz w:val="36"/>
+          <w:szCs w:val="36"/>
           <w:rtl w:val="0"/>
         </w:rPr>
         <w:t xml:space="preserve">Параметры</w:t>
       </w:r>
+    </w:p>
+    <w:p>
+      <w:pPr>
+        <w:ind w:left="0" w:firstLine="0"/>
+        <w:jc w:val="center"/>
+        <w:rPr>
+          <w:b w:val="1"/>
+          <w:bCs w:val="1"/>
+          <w:sz w:val="36"/>
+          <w:szCs w:val="36"/>
+        </w:rPr>
+      </w:pPr>
       <w:r>
         <w:rPr>
           <w:rtl w:val="0"/>
@@ -112,19 +1422,609 @@
       <w:pPr>
         <w:numPr>
           <w:ilvl w:val="0"/>
-          <w:numId w:val="3"/>
+          <w:numId w:val="4"/>
         </w:numPr>
         <w:ind w:left="720" w:hanging="360"/>
         <w:jc w:val="left"/>
         <w:rPr>
-          <w:u w:val="none"/>
-        </w:rPr>
-      </w:pPr>
-      <w:r>
-        <w:rPr>
-          <w:rtl w:val="0"/>
-        </w:rPr>
-        <w:t xml:space="preserve">Создание параметров</w:t>
+          <w:b w:val="1"/>
+          <w:bCs w:val="1"/>
+        </w:rPr>
+      </w:pPr>
+      <w:r>
+        <w:rPr>
+          <w:b w:val="1"/>
+          <w:bCs w:val="1"/>
+          <w:rtl w:val="0"/>
+        </w:rPr>
+        <w:t xml:space="preserve">Присвоение еще одного параметра на ган. В таблицу parameters добавляется еще 1 столбец mode. По умолчанию при создании строки для mode уже присваивается значение Both. Если создается второй активный параметр на ган, то для первого параметра mode присваивается значение A, а для второго B</w:t>
+      </w:r>
+    </w:p>
+    <w:p>
+      <w:pPr>
+        <w:ind w:left="0" w:firstLine="0"/>
+        <w:jc w:val="left"/>
+        <w:rPr>
+          <w:b w:val="1"/>
+          <w:bCs w:val="1"/>
+        </w:rPr>
+      </w:pPr>
+      <w:r>
+        <w:rPr>
+          <w:rtl w:val="0"/>
+        </w:rPr>
+      </w:r>
+    </w:p>
+    <w:p>
+      <w:pPr>
+        <w:rPr/>
+      </w:pPr>
+      <w:r>
+        <w:rPr>
+          <w:rtl w:val="0"/>
+        </w:rPr>
+        <w:t xml:space="preserve">BEGIN TRANSACTION;</w:t>
+      </w:r>
+    </w:p>
+    <w:p>
+      <w:pPr>
+        <w:rPr/>
+      </w:pPr>
+      <w:r>
+        <w:rPr>
+          <w:rtl w:val="0"/>
+        </w:rPr>
+      </w:r>
+    </w:p>
+    <w:p>
+      <w:pPr>
+        <w:rPr/>
+      </w:pPr>
+      <w:r>
+        <w:rPr>
+          <w:rtl w:val="0"/>
+        </w:rPr>
+        <w:t xml:space="preserve">-- Шаг 1: Находим текущий активный параметр(ы), привязанный к этим клещам, </w:t>
+      </w:r>
+    </w:p>
+    <w:p>
+      <w:pPr>
+        <w:rPr/>
+      </w:pPr>
+      <w:r>
+        <w:rPr>
+          <w:rtl w:val="0"/>
+        </w:rPr>
+        <w:t xml:space="preserve">-- и переводим его в режим 'A'.</w:t>
+      </w:r>
+    </w:p>
+    <w:p>
+      <w:pPr>
+        <w:rPr/>
+      </w:pPr>
+      <w:r>
+        <w:rPr>
+          <w:rtl w:val="0"/>
+        </w:rPr>
+        <w:t xml:space="preserve">-- Мы используем вложенный запрос, чтобы база сама нашла нужный parameter_id.</w:t>
+      </w:r>
+    </w:p>
+    <w:p>
+      <w:pPr>
+        <w:rPr/>
+      </w:pPr>
+      <w:r>
+        <w:rPr>
+          <w:rtl w:val="0"/>
+        </w:rPr>
+        <w:t xml:space="preserve">UPDATE parameters </w:t>
+      </w:r>
+    </w:p>
+    <w:p>
+      <w:pPr>
+        <w:rPr/>
+      </w:pPr>
+      <w:r>
+        <w:rPr>
+          <w:rtl w:val="0"/>
+        </w:rPr>
+        <w:t xml:space="preserve">SET mode = 'A' </w:t>
+      </w:r>
+    </w:p>
+    <w:p>
+      <w:pPr>
+        <w:rPr/>
+      </w:pPr>
+      <w:r>
+        <w:rPr>
+          <w:rtl w:val="0"/>
+        </w:rPr>
+        <w:t xml:space="preserve">WHERE rowid IN (</w:t>
+      </w:r>
+    </w:p>
+    <w:p>
+      <w:pPr>
+        <w:rPr/>
+      </w:pPr>
+      <w:r>
+        <w:rPr>
+          <w:rtl w:val="0"/>
+        </w:rPr>
+        <w:t xml:space="preserve">    SELECT parameter_id </w:t>
+      </w:r>
+    </w:p>
+    <w:p>
+      <w:pPr>
+        <w:rPr/>
+      </w:pPr>
+      <w:r>
+        <w:rPr>
+          <w:rtl w:val="0"/>
+        </w:rPr>
+        <w:t xml:space="preserve">    FROM welding_setup </w:t>
+      </w:r>
+    </w:p>
+    <w:p>
+      <w:pPr>
+        <w:rPr/>
+      </w:pPr>
+      <w:r>
+        <w:rPr>
+          <w:rtl w:val="0"/>
+        </w:rPr>
+        <w:t xml:space="preserve">    WHERE gun_id = 3 AND is_active = 1</w:t>
+      </w:r>
+    </w:p>
+    <w:p>
+      <w:pPr>
+        <w:rPr/>
+      </w:pPr>
+      <w:r>
+        <w:rPr>
+          <w:rtl w:val="0"/>
+        </w:rPr>
+        <w:t xml:space="preserve">);</w:t>
+      </w:r>
+    </w:p>
+    <w:p>
+      <w:pPr>
+        <w:rPr/>
+      </w:pPr>
+      <w:r>
+        <w:rPr>
+          <w:rtl w:val="0"/>
+        </w:rPr>
+      </w:r>
+    </w:p>
+    <w:p>
+      <w:pPr>
+        <w:rPr/>
+      </w:pPr>
+      <w:r>
+        <w:rPr>
+          <w:rtl w:val="0"/>
+        </w:rPr>
+        <w:t xml:space="preserve">-- Шаг 2: Создаем новый параметр для этих же клещей и сразу указываем режим 'B'.</w:t>
+      </w:r>
+    </w:p>
+    <w:p>
+      <w:pPr>
+        <w:rPr/>
+      </w:pPr>
+      <w:r>
+        <w:rPr>
+          <w:rtl w:val="0"/>
+        </w:rPr>
+        <w:t xml:space="preserve">INSERT INTO parameters (</w:t>
+      </w:r>
+    </w:p>
+    <w:p>
+      <w:pPr>
+        <w:rPr/>
+      </w:pPr>
+      <w:r>
+        <w:rPr>
+          <w:rtl w:val="0"/>
+        </w:rPr>
+        <w:t xml:space="preserve">    pressure, </w:t>
+      </w:r>
+    </w:p>
+    <w:p>
+      <w:pPr>
+        <w:rPr/>
+      </w:pPr>
+      <w:r>
+        <w:rPr>
+          <w:rtl w:val="0"/>
+        </w:rPr>
+        <w:t xml:space="preserve">    squeeze_time, </w:t>
+      </w:r>
+    </w:p>
+    <w:p>
+      <w:pPr>
+        <w:rPr/>
+      </w:pPr>
+      <w:r>
+        <w:rPr>
+          <w:rtl w:val="0"/>
+        </w:rPr>
+        <w:t xml:space="preserve">    weld_time, </w:t>
+      </w:r>
+    </w:p>
+    <w:p>
+      <w:pPr>
+        <w:rPr/>
+      </w:pPr>
+      <w:r>
+        <w:rPr>
+          <w:rtl w:val="0"/>
+        </w:rPr>
+        <w:t xml:space="preserve">    cool_time, </w:t>
+      </w:r>
+    </w:p>
+    <w:p>
+      <w:pPr>
+        <w:rPr/>
+      </w:pPr>
+      <w:r>
+        <w:rPr>
+          <w:rtl w:val="0"/>
+        </w:rPr>
+        <w:t xml:space="preserve">    hold_time, </w:t>
+      </w:r>
+    </w:p>
+    <w:p>
+      <w:pPr>
+        <w:rPr/>
+      </w:pPr>
+      <w:r>
+        <w:rPr>
+          <w:rtl w:val="0"/>
+        </w:rPr>
+        <w:t xml:space="preserve">    mode</w:t>
+      </w:r>
+    </w:p>
+    <w:p>
+      <w:pPr>
+        <w:rPr/>
+      </w:pPr>
+      <w:r>
+        <w:rPr>
+          <w:rtl w:val="0"/>
+        </w:rPr>
+        <w:t xml:space="preserve">) </w:t>
+      </w:r>
+    </w:p>
+    <w:p>
+      <w:pPr>
+        <w:rPr/>
+      </w:pPr>
+      <w:r>
+        <w:rPr>
+          <w:rtl w:val="0"/>
+        </w:rPr>
+        <w:t xml:space="preserve">VALUES (</w:t>
+      </w:r>
+    </w:p>
+    <w:p>
+      <w:pPr>
+        <w:rPr/>
+      </w:pPr>
+      <w:r>
+        <w:rPr>
+          <w:rtl w:val="0"/>
+        </w:rPr>
+        <w:t xml:space="preserve">    3.0,  -- Допустим, для более толстого металла нужно большее давление</w:t>
+      </w:r>
+    </w:p>
+    <w:p>
+      <w:pPr>
+        <w:rPr/>
+      </w:pPr>
+      <w:r>
+        <w:rPr>
+          <w:rtl w:val="0"/>
+        </w:rPr>
+        <w:t xml:space="preserve">    15, </w:t>
+      </w:r>
+    </w:p>
+    <w:p>
+      <w:pPr>
+        <w:rPr/>
+      </w:pPr>
+      <w:r>
+        <w:rPr>
+          <w:rtl w:val="0"/>
+        </w:rPr>
+        <w:t xml:space="preserve">    16,   -- И большее время сварки</w:t>
+      </w:r>
+    </w:p>
+    <w:p>
+      <w:pPr>
+        <w:rPr/>
+      </w:pPr>
+      <w:r>
+        <w:rPr>
+          <w:rtl w:val="0"/>
+        </w:rPr>
+        <w:t xml:space="preserve">    2, </w:t>
+      </w:r>
+    </w:p>
+    <w:p>
+      <w:pPr>
+        <w:rPr/>
+      </w:pPr>
+      <w:r>
+        <w:rPr>
+          <w:rtl w:val="0"/>
+        </w:rPr>
+        <w:t xml:space="preserve">    5,</w:t>
+      </w:r>
+    </w:p>
+    <w:p>
+      <w:pPr>
+        <w:rPr/>
+      </w:pPr>
+      <w:r>
+        <w:rPr>
+          <w:rtl w:val="0"/>
+        </w:rPr>
+        <w:t xml:space="preserve">    'B'   -- Явно указываем второй режим</w:t>
+      </w:r>
+    </w:p>
+    <w:p>
+      <w:pPr>
+        <w:rPr/>
+      </w:pPr>
+      <w:r>
+        <w:rPr>
+          <w:rtl w:val="0"/>
+        </w:rPr>
+        <w:t xml:space="preserve">);</w:t>
+      </w:r>
+    </w:p>
+    <w:p>
+      <w:pPr>
+        <w:rPr/>
+      </w:pPr>
+      <w:r>
+        <w:rPr>
+          <w:rtl w:val="0"/>
+        </w:rPr>
+      </w:r>
+    </w:p>
+    <w:p>
+      <w:pPr>
+        <w:rPr/>
+      </w:pPr>
+      <w:r>
+        <w:rPr>
+          <w:rtl w:val="0"/>
+        </w:rPr>
+        <w:t xml:space="preserve">-- Шаг 3: Привязываем этот новый параметр (Mode B) к клещам и новой точке.</w:t>
+      </w:r>
+    </w:p>
+    <w:p>
+      <w:pPr>
+        <w:rPr/>
+      </w:pPr>
+      <w:r>
+        <w:rPr>
+          <w:rtl w:val="0"/>
+        </w:rPr>
+        <w:t xml:space="preserve">-- Старая запись при этом остается is_active = 1, так как клещи теперь работают в двух режимах.</w:t>
+      </w:r>
+    </w:p>
+    <w:p>
+      <w:pPr>
+        <w:rPr/>
+      </w:pPr>
+      <w:r>
+        <w:rPr>
+          <w:rtl w:val="0"/>
+        </w:rPr>
+        <w:t xml:space="preserve">INSERT INTO welding_setup (</w:t>
+      </w:r>
+    </w:p>
+    <w:p>
+      <w:pPr>
+        <w:rPr/>
+      </w:pPr>
+      <w:r>
+        <w:rPr>
+          <w:rtl w:val="0"/>
+        </w:rPr>
+        <w:t xml:space="preserve">    spot_id, </w:t>
+      </w:r>
+    </w:p>
+    <w:p>
+      <w:pPr>
+        <w:rPr/>
+      </w:pPr>
+      <w:r>
+        <w:rPr>
+          <w:rtl w:val="0"/>
+        </w:rPr>
+        <w:t xml:space="preserve">    gun_id, </w:t>
+      </w:r>
+    </w:p>
+    <w:p>
+      <w:pPr>
+        <w:rPr/>
+      </w:pPr>
+      <w:r>
+        <w:rPr>
+          <w:rtl w:val="0"/>
+        </w:rPr>
+        <w:t xml:space="preserve">    parameter_id, </w:t>
+      </w:r>
+    </w:p>
+    <w:p>
+      <w:pPr>
+        <w:rPr/>
+      </w:pPr>
+      <w:r>
+        <w:rPr>
+          <w:rtl w:val="0"/>
+        </w:rPr>
+        <w:t xml:space="preserve">    start_date, </w:t>
+      </w:r>
+    </w:p>
+    <w:p>
+      <w:pPr>
+        <w:rPr/>
+      </w:pPr>
+      <w:r>
+        <w:rPr>
+          <w:rtl w:val="0"/>
+        </w:rPr>
+        <w:t xml:space="preserve">    is_active, </w:t>
+      </w:r>
+    </w:p>
+    <w:p>
+      <w:pPr>
+        <w:rPr/>
+      </w:pPr>
+      <w:r>
+        <w:rPr>
+          <w:rtl w:val="0"/>
+        </w:rPr>
+        <w:t xml:space="preserve">    comments</w:t>
+      </w:r>
+    </w:p>
+    <w:p>
+      <w:pPr>
+        <w:rPr/>
+      </w:pPr>
+      <w:r>
+        <w:rPr>
+          <w:rtl w:val="0"/>
+        </w:rPr>
+        <w:t xml:space="preserve">) </w:t>
+      </w:r>
+    </w:p>
+    <w:p>
+      <w:pPr>
+        <w:rPr/>
+      </w:pPr>
+      <w:r>
+        <w:rPr>
+          <w:rtl w:val="0"/>
+        </w:rPr>
+        <w:t xml:space="preserve">VALUES (</w:t>
+      </w:r>
+    </w:p>
+    <w:p>
+      <w:pPr>
+        <w:rPr/>
+      </w:pPr>
+      <w:r>
+        <w:rPr>
+          <w:rtl w:val="0"/>
+        </w:rPr>
+        <w:t xml:space="preserve">    106,                  -- Новая точка для толстого металла</w:t>
+      </w:r>
+    </w:p>
+    <w:p>
+      <w:pPr>
+        <w:rPr/>
+      </w:pPr>
+      <w:r>
+        <w:rPr>
+          <w:rtl w:val="0"/>
+        </w:rPr>
+        <w:t xml:space="preserve">    3,                    -- Те же самые клещи</w:t>
+      </w:r>
+    </w:p>
+    <w:p>
+      <w:pPr>
+        <w:rPr/>
+      </w:pPr>
+      <w:r>
+        <w:rPr>
+          <w:rtl w:val="0"/>
+        </w:rPr>
+        <w:t xml:space="preserve">    last_insert_rowid(),  -- ID только что созданного параметра Mode B</w:t>
+      </w:r>
+    </w:p>
+    <w:p>
+      <w:pPr>
+        <w:rPr/>
+      </w:pPr>
+      <w:r>
+        <w:rPr>
+          <w:rtl w:val="0"/>
+        </w:rPr>
+        <w:t xml:space="preserve">    '2026-05-15', </w:t>
+      </w:r>
+    </w:p>
+    <w:p>
+      <w:pPr>
+        <w:rPr/>
+      </w:pPr>
+      <w:r>
+        <w:rPr>
+          <w:rtl w:val="0"/>
+        </w:rPr>
+        <w:t xml:space="preserve">    1,                    -- Статус активен (теперь активны обе настройки)</w:t>
+      </w:r>
+    </w:p>
+    <w:p>
+      <w:pPr>
+        <w:rPr/>
+      </w:pPr>
+      <w:r>
+        <w:rPr>
+          <w:rtl w:val="0"/>
+        </w:rPr>
+        <w:t xml:space="preserve">    'Включен второй режим сварки (Mode B) для другой толщины'</w:t>
+      </w:r>
+    </w:p>
+    <w:p>
+      <w:pPr>
+        <w:rPr/>
+      </w:pPr>
+      <w:r>
+        <w:rPr>
+          <w:rtl w:val="0"/>
+        </w:rPr>
+        <w:t xml:space="preserve">);</w:t>
+      </w:r>
+    </w:p>
+    <w:p>
+      <w:pPr>
+        <w:rPr/>
+      </w:pPr>
+      <w:r>
+        <w:rPr>
+          <w:rtl w:val="0"/>
+        </w:rPr>
+      </w:r>
+    </w:p>
+    <w:p>
+      <w:pPr>
+        <w:rPr/>
+      </w:pPr>
+      <w:r>
+        <w:rPr>
+          <w:rtl w:val="0"/>
+        </w:rPr>
+        <w:t xml:space="preserve">COMMIT;</w:t>
+      </w:r>
+    </w:p>
+    <w:p>
+      <w:pPr>
+        <w:ind w:left="0" w:firstLine="0"/>
+        <w:jc w:val="left"/>
+        <w:rPr>
+          <w:b w:val="1"/>
+          <w:bCs w:val="1"/>
+        </w:rPr>
+      </w:pPr>
+      <w:r>
+        <w:rPr>
+          <w:rtl w:val="0"/>
+        </w:rPr>
       </w:r>
     </w:p>
     <w:p>
@@ -132,17 +2032,510 @@
         <w:ind w:left="0" w:firstLine="0"/>
         <w:jc w:val="center"/>
         <w:rPr>
+          <w:b w:val="1"/>
+          <w:bCs w:val="1"/>
           <w:sz w:val="36"/>
           <w:szCs w:val="36"/>
         </w:rPr>
       </w:pPr>
       <w:r>
         <w:rPr>
+          <w:b w:val="1"/>
+          <w:bCs w:val="1"/>
           <w:sz w:val="36"/>
           <w:szCs w:val="36"/>
           <w:rtl w:val="0"/>
         </w:rPr>
         <w:t xml:space="preserve">Дефект</w:t>
+      </w:r>
+    </w:p>
+    <w:p>
+      <w:pPr>
+        <w:numPr>
+          <w:ilvl w:val="0"/>
+          <w:numId w:val="7"/>
+        </w:numPr>
+        <w:ind w:left="720" w:hanging="360"/>
+        <w:jc w:val="left"/>
+        <w:rPr>
+          <w:b w:val="1"/>
+          <w:bCs w:val="1"/>
+        </w:rPr>
+      </w:pPr>
+      <w:r>
+        <w:rPr>
+          <w:b w:val="1"/>
+          <w:bCs w:val="1"/>
+          <w:rtl w:val="0"/>
+        </w:rPr>
+        <w:t xml:space="preserve">Создание дефекта</w:t>
+      </w:r>
+    </w:p>
+    <w:p>
+      <w:pPr>
+        <w:ind w:left="720" w:firstLine="0"/>
+        <w:jc w:val="left"/>
+        <w:rPr>
+          <w:b w:val="1"/>
+          <w:bCs w:val="1"/>
+        </w:rPr>
+      </w:pPr>
+      <w:r>
+        <w:rPr>
+          <w:rtl w:val="0"/>
+        </w:rPr>
+      </w:r>
+    </w:p>
+    <w:p>
+      <w:pPr>
+        <w:rPr/>
+      </w:pPr>
+      <w:r>
+        <w:rPr>
+          <w:rtl w:val="0"/>
+        </w:rPr>
+        <w:t xml:space="preserve">-- Транзакция здесь не обязательна, так как мы пишем только в одну таблицу, </w:t>
+      </w:r>
+    </w:p>
+    <w:p>
+      <w:pPr>
+        <w:rPr/>
+      </w:pPr>
+      <w:r>
+        <w:rPr>
+          <w:rtl w:val="0"/>
+        </w:rPr>
+        <w:t xml:space="preserve">-- но для порядка можно использовать.</w:t>
+      </w:r>
+    </w:p>
+    <w:p>
+      <w:pPr>
+        <w:rPr/>
+      </w:pPr>
+      <w:r>
+        <w:rPr>
+          <w:rtl w:val="0"/>
+        </w:rPr>
+        <w:t xml:space="preserve">BEGIN TRANSACTION;</w:t>
+      </w:r>
+    </w:p>
+    <w:p>
+      <w:pPr>
+        <w:rPr/>
+      </w:pPr>
+      <w:r>
+        <w:rPr>
+          <w:rtl w:val="0"/>
+        </w:rPr>
+      </w:r>
+    </w:p>
+    <w:p>
+      <w:pPr>
+        <w:rPr/>
+      </w:pPr>
+      <w:r>
+        <w:rPr>
+          <w:rtl w:val="0"/>
+        </w:rPr>
+        <w:t xml:space="preserve">INSERT INTO defects (</w:t>
+      </w:r>
+    </w:p>
+    <w:p>
+      <w:pPr>
+        <w:rPr/>
+      </w:pPr>
+      <w:r>
+        <w:rPr>
+          <w:rtl w:val="0"/>
+        </w:rPr>
+        <w:t xml:space="preserve">    problem_code, </w:t>
+      </w:r>
+    </w:p>
+    <w:p>
+      <w:pPr>
+        <w:rPr/>
+      </w:pPr>
+      <w:r>
+        <w:rPr>
+          <w:rtl w:val="0"/>
+        </w:rPr>
+        <w:t xml:space="preserve">    root_cause, </w:t>
+      </w:r>
+    </w:p>
+    <w:p>
+      <w:pPr>
+        <w:rPr/>
+      </w:pPr>
+      <w:r>
+        <w:rPr>
+          <w:rtl w:val="0"/>
+        </w:rPr>
+        <w:t xml:space="preserve">    solution, </w:t>
+      </w:r>
+    </w:p>
+    <w:p>
+      <w:pPr>
+        <w:rPr/>
+      </w:pPr>
+      <w:r>
+        <w:rPr>
+          <w:rtl w:val="0"/>
+        </w:rPr>
+        <w:t xml:space="preserve">    df_date, </w:t>
+      </w:r>
+    </w:p>
+    <w:p>
+      <w:pPr>
+        <w:rPr/>
+      </w:pPr>
+      <w:r>
+        <w:rPr>
+          <w:rtl w:val="0"/>
+        </w:rPr>
+        <w:t xml:space="preserve">    worker_name,  -- В вашей схеме здесь тип INTEGER, значит это ID работника</w:t>
+      </w:r>
+    </w:p>
+    <w:p>
+      <w:pPr>
+        <w:rPr/>
+      </w:pPr>
+      <w:r>
+        <w:rPr>
+          <w:rtl w:val="0"/>
+        </w:rPr>
+        <w:t xml:space="preserve">    spot_id, </w:t>
+      </w:r>
+    </w:p>
+    <w:p>
+      <w:pPr>
+        <w:rPr/>
+      </w:pPr>
+      <w:r>
+        <w:rPr>
+          <w:rtl w:val="0"/>
+        </w:rPr>
+        <w:t xml:space="preserve">    gun_id</w:t>
+      </w:r>
+    </w:p>
+    <w:p>
+      <w:pPr>
+        <w:rPr/>
+      </w:pPr>
+      <w:r>
+        <w:rPr>
+          <w:rtl w:val="0"/>
+        </w:rPr>
+        <w:t xml:space="preserve">) </w:t>
+      </w:r>
+    </w:p>
+    <w:p>
+      <w:pPr>
+        <w:rPr/>
+      </w:pPr>
+      <w:r>
+        <w:rPr>
+          <w:rtl w:val="0"/>
+        </w:rPr>
+        <w:t xml:space="preserve">VALUES (</w:t>
+      </w:r>
+    </w:p>
+    <w:p>
+      <w:pPr>
+        <w:rPr/>
+      </w:pPr>
+      <w:r>
+        <w:rPr>
+          <w:rtl w:val="0"/>
+        </w:rPr>
+        <w:t xml:space="preserve">    'E04',                          -- Код проблемы (например: сильные выплески/брызги)</w:t>
+      </w:r>
+    </w:p>
+    <w:p>
+      <w:pPr>
+        <w:rPr/>
+      </w:pPr>
+      <w:r>
+        <w:rPr>
+          <w:rtl w:val="0"/>
+        </w:rPr>
+        <w:t xml:space="preserve">    'Критический износ электродов', -- Первопричина</w:t>
+      </w:r>
+    </w:p>
+    <w:p>
+      <w:pPr>
+        <w:rPr/>
+      </w:pPr>
+      <w:r>
+        <w:rPr>
+          <w:rtl w:val="0"/>
+        </w:rPr>
+        <w:t xml:space="preserve">    'Замена колпачков электродов, зачистка контакта', -- Принятое решение</w:t>
+      </w:r>
+    </w:p>
+    <w:p>
+      <w:pPr>
+        <w:rPr/>
+      </w:pPr>
+      <w:r>
+        <w:rPr>
+          <w:rtl w:val="0"/>
+        </w:rPr>
+        <w:t xml:space="preserve">    '2026-05-15',                   -- Дата фиксации дефекта</w:t>
+      </w:r>
+    </w:p>
+    <w:p>
+      <w:pPr>
+        <w:rPr/>
+      </w:pPr>
+      <w:r>
+        <w:rPr>
+          <w:rtl w:val="0"/>
+        </w:rPr>
+        <w:t xml:space="preserve">    2,                              -- ID сотрудника (например, Даненов Нуржан)</w:t>
+      </w:r>
+    </w:p>
+    <w:p>
+      <w:pPr>
+        <w:rPr/>
+      </w:pPr>
+      <w:r>
+        <w:rPr>
+          <w:rtl w:val="0"/>
+        </w:rPr>
+        <w:t xml:space="preserve">    105,                            -- На какой точке это произошло</w:t>
+      </w:r>
+    </w:p>
+    <w:p>
+      <w:pPr>
+        <w:rPr/>
+      </w:pPr>
+      <w:r>
+        <w:rPr>
+          <w:rtl w:val="0"/>
+        </w:rPr>
+        <w:t xml:space="preserve">    3                               -- Какими клещами варили</w:t>
+      </w:r>
+    </w:p>
+    <w:p>
+      <w:pPr>
+        <w:rPr/>
+      </w:pPr>
+      <w:r>
+        <w:rPr>
+          <w:rtl w:val="0"/>
+        </w:rPr>
+        <w:t xml:space="preserve">);</w:t>
+      </w:r>
+    </w:p>
+    <w:p>
+      <w:pPr>
+        <w:rPr/>
+      </w:pPr>
+      <w:r>
+        <w:rPr>
+          <w:rtl w:val="0"/>
+        </w:rPr>
+      </w:r>
+    </w:p>
+    <w:p>
+      <w:pPr>
+        <w:rPr/>
+      </w:pPr>
+      <w:r>
+        <w:rPr>
+          <w:rtl w:val="0"/>
+        </w:rPr>
+        <w:t xml:space="preserve">COMMIT;</w:t>
+      </w:r>
+    </w:p>
+    <w:p>
+      <w:pPr>
+        <w:ind w:left="0" w:firstLine="0"/>
+        <w:jc w:val="left"/>
+        <w:rPr>
+          <w:b w:val="1"/>
+          <w:bCs w:val="1"/>
+        </w:rPr>
+      </w:pPr>
+      <w:r>
+        <w:rPr>
+          <w:rtl w:val="0"/>
+        </w:rPr>
+      </w:r>
+    </w:p>
+    <w:p>
+      <w:pPr>
+        <w:numPr>
+          <w:ilvl w:val="0"/>
+          <w:numId w:val="7"/>
+        </w:numPr>
+        <w:ind w:left="720" w:hanging="360"/>
+        <w:jc w:val="left"/>
+        <w:rPr>
+          <w:b w:val="1"/>
+          <w:bCs w:val="1"/>
+        </w:rPr>
+      </w:pPr>
+      <w:r>
+        <w:rPr>
+          <w:b w:val="1"/>
+          <w:bCs w:val="1"/>
+          <w:rtl w:val="0"/>
+        </w:rPr>
+        <w:t xml:space="preserve">Удаление дефекта</w:t>
+      </w:r>
+    </w:p>
+    <w:p>
+      <w:pPr>
+        <w:ind w:left="0" w:firstLine="0"/>
+        <w:jc w:val="left"/>
+        <w:rPr/>
+      </w:pPr>
+      <w:r>
+        <w:rPr>
+          <w:rtl w:val="0"/>
+        </w:rPr>
+      </w:r>
+    </w:p>
+    <w:p>
+      <w:pPr>
+        <w:rPr/>
+      </w:pPr>
+      <w:r>
+        <w:rPr>
+          <w:rtl w:val="0"/>
+        </w:rPr>
+        <w:t xml:space="preserve">BEGIN TRANSACTION;</w:t>
+      </w:r>
+    </w:p>
+    <w:p>
+      <w:pPr>
+        <w:rPr/>
+      </w:pPr>
+      <w:r>
+        <w:rPr>
+          <w:rtl w:val="0"/>
+        </w:rPr>
+      </w:r>
+    </w:p>
+    <w:p>
+      <w:pPr>
+        <w:rPr/>
+      </w:pPr>
+      <w:r>
+        <w:rPr>
+          <w:rtl w:val="0"/>
+        </w:rPr>
+        <w:t xml:space="preserve">DELETE FROM defects </w:t>
+      </w:r>
+    </w:p>
+    <w:p>
+      <w:pPr>
+        <w:rPr/>
+      </w:pPr>
+      <w:r>
+        <w:rPr>
+          <w:rtl w:val="0"/>
+        </w:rPr>
+        <w:t xml:space="preserve">WHERE spot_id = 105 </w:t>
+      </w:r>
+    </w:p>
+    <w:p>
+      <w:pPr>
+        <w:rPr/>
+      </w:pPr>
+      <w:r>
+        <w:rPr>
+          <w:rtl w:val="0"/>
+        </w:rPr>
+        <w:t xml:space="preserve">  AND problem_code = 'E04' </w:t>
+      </w:r>
+    </w:p>
+    <w:p>
+      <w:pPr>
+        <w:rPr/>
+      </w:pPr>
+      <w:r>
+        <w:rPr>
+          <w:rtl w:val="0"/>
+        </w:rPr>
+        <w:t xml:space="preserve">  AND df_date = '2026-05-15';</w:t>
+      </w:r>
+    </w:p>
+    <w:p>
+      <w:pPr>
+        <w:rPr/>
+      </w:pPr>
+      <w:r>
+        <w:rPr>
+          <w:rtl w:val="0"/>
+        </w:rPr>
+      </w:r>
+    </w:p>
+    <w:p>
+      <w:pPr>
+        <w:rPr/>
+      </w:pPr>
+      <w:r>
+        <w:rPr>
+          <w:rtl w:val="0"/>
+        </w:rPr>
+        <w:t xml:space="preserve">COMMIT;</w:t>
+      </w:r>
+    </w:p>
+    <w:p>
+      <w:pPr>
+        <w:ind w:left="0" w:firstLine="0"/>
+        <w:jc w:val="left"/>
+        <w:rPr>
+          <w:b w:val="1"/>
+          <w:bCs w:val="1"/>
+        </w:rPr>
+      </w:pPr>
+      <w:r>
+        <w:rPr>
+          <w:rtl w:val="0"/>
+        </w:rPr>
+      </w:r>
+    </w:p>
+    <w:p>
+      <w:pPr>
+        <w:ind w:left="0" w:firstLine="0"/>
+        <w:jc w:val="left"/>
+        <w:rPr>
+          <w:b w:val="1"/>
+          <w:bCs w:val="1"/>
+        </w:rPr>
+      </w:pPr>
+      <w:r>
+        <w:rPr>
+          <w:rtl w:val="0"/>
+        </w:rPr>
+      </w:r>
+    </w:p>
+    <w:p>
+      <w:pPr>
+        <w:ind w:left="0" w:firstLine="0"/>
+        <w:jc w:val="center"/>
+        <w:rPr>
+          <w:b w:val="1"/>
+          <w:bCs w:val="1"/>
+        </w:rPr>
+      </w:pPr>
+      <w:r>
+        <w:rPr>
+          <w:b w:val="1"/>
+          <w:bCs w:val="1"/>
+          <w:sz w:val="36"/>
+          <w:szCs w:val="36"/>
+          <w:rtl w:val="0"/>
+        </w:rPr>
+        <w:t xml:space="preserve">ТО</w:t>
+      </w:r>
+      <w:r>
+        <w:rPr>
+          <w:rtl w:val="0"/>
+        </w:rPr>
       </w:r>
     </w:p>
     <w:p>
@@ -154,14 +2547,331 @@
         <w:ind w:left="720" w:hanging="360"/>
         <w:jc w:val="left"/>
         <w:rPr>
-          <w:u w:val="none"/>
-        </w:rPr>
-      </w:pPr>
-      <w:r>
-        <w:rPr>
-          <w:rtl w:val="0"/>
-        </w:rPr>
-        <w:t xml:space="preserve">Создание дефекта</w:t>
+          <w:b w:val="1"/>
+          <w:bCs w:val="1"/>
+        </w:rPr>
+      </w:pPr>
+      <w:r>
+        <w:rPr>
+          <w:b w:val="1"/>
+          <w:bCs w:val="1"/>
+          <w:rtl w:val="0"/>
+        </w:rPr>
+        <w:t xml:space="preserve">Создание ТО гана</w:t>
+      </w:r>
+    </w:p>
+    <w:p>
+      <w:pPr>
+        <w:ind w:left="0" w:firstLine="0"/>
+        <w:jc w:val="left"/>
+        <w:rPr>
+          <w:b w:val="1"/>
+          <w:bCs w:val="1"/>
+        </w:rPr>
+      </w:pPr>
+      <w:r>
+        <w:rPr>
+          <w:rtl w:val="0"/>
+        </w:rPr>
+      </w:r>
+    </w:p>
+    <w:p>
+      <w:pPr>
+        <w:rPr/>
+      </w:pPr>
+      <w:r>
+        <w:rPr>
+          <w:rtl w:val="0"/>
+        </w:rPr>
+        <w:t xml:space="preserve">BEGIN TRANSACTION;</w:t>
+      </w:r>
+    </w:p>
+    <w:p>
+      <w:pPr>
+        <w:rPr/>
+      </w:pPr>
+      <w:r>
+        <w:rPr>
+          <w:rtl w:val="0"/>
+        </w:rPr>
+      </w:r>
+    </w:p>
+    <w:p>
+      <w:pPr>
+        <w:rPr/>
+      </w:pPr>
+      <w:r>
+        <w:rPr>
+          <w:rtl w:val="0"/>
+        </w:rPr>
+        <w:t xml:space="preserve">INSERT INTO maintenance (</w:t>
+      </w:r>
+    </w:p>
+    <w:p>
+      <w:pPr>
+        <w:rPr/>
+      </w:pPr>
+      <w:r>
+        <w:rPr>
+          <w:rtl w:val="0"/>
+        </w:rPr>
+        <w:t xml:space="preserve">    first_weld, </w:t>
+      </w:r>
+    </w:p>
+    <w:p>
+      <w:pPr>
+        <w:rPr/>
+      </w:pPr>
+      <w:r>
+        <w:rPr>
+          <w:rtl w:val="0"/>
+        </w:rPr>
+        <w:t xml:space="preserve">    second_weld, </w:t>
+      </w:r>
+    </w:p>
+    <w:p>
+      <w:pPr>
+        <w:rPr/>
+      </w:pPr>
+      <w:r>
+        <w:rPr>
+          <w:rtl w:val="0"/>
+        </w:rPr>
+        <w:t xml:space="preserve">    third_weld, </w:t>
+      </w:r>
+    </w:p>
+    <w:p>
+      <w:pPr>
+        <w:rPr/>
+      </w:pPr>
+      <w:r>
+        <w:rPr>
+          <w:rtl w:val="0"/>
+        </w:rPr>
+        <w:t xml:space="preserve">    first_pressure, </w:t>
+      </w:r>
+    </w:p>
+    <w:p>
+      <w:pPr>
+        <w:rPr/>
+      </w:pPr>
+      <w:r>
+        <w:rPr>
+          <w:rtl w:val="0"/>
+        </w:rPr>
+        <w:t xml:space="preserve">    second_pressure, </w:t>
+      </w:r>
+    </w:p>
+    <w:p>
+      <w:pPr>
+        <w:rPr/>
+      </w:pPr>
+      <w:r>
+        <w:rPr>
+          <w:rtl w:val="0"/>
+        </w:rPr>
+        <w:t xml:space="preserve">    third_pressure, </w:t>
+      </w:r>
+    </w:p>
+    <w:p>
+      <w:pPr>
+        <w:rPr/>
+      </w:pPr>
+      <w:r>
+        <w:rPr>
+          <w:rtl w:val="0"/>
+        </w:rPr>
+        <w:t xml:space="preserve">    to_date, </w:t>
+      </w:r>
+    </w:p>
+    <w:p>
+      <w:pPr>
+        <w:rPr/>
+      </w:pPr>
+      <w:r>
+        <w:rPr>
+          <w:rtl w:val="0"/>
+        </w:rPr>
+        <w:t xml:space="preserve">    worker_id, </w:t>
+      </w:r>
+    </w:p>
+    <w:p>
+      <w:pPr>
+        <w:rPr/>
+      </w:pPr>
+      <w:r>
+        <w:rPr>
+          <w:rtl w:val="0"/>
+        </w:rPr>
+        <w:t xml:space="preserve">    gun_id</w:t>
+      </w:r>
+    </w:p>
+    <w:p>
+      <w:pPr>
+        <w:rPr/>
+      </w:pPr>
+      <w:r>
+        <w:rPr>
+          <w:rtl w:val="0"/>
+        </w:rPr>
+        <w:t xml:space="preserve">) </w:t>
+      </w:r>
+    </w:p>
+    <w:p>
+      <w:pPr>
+        <w:rPr/>
+      </w:pPr>
+      <w:r>
+        <w:rPr>
+          <w:rtl w:val="0"/>
+        </w:rPr>
+        <w:t xml:space="preserve">VALUES (</w:t>
+      </w:r>
+    </w:p>
+    <w:p>
+      <w:pPr>
+        <w:rPr/>
+      </w:pPr>
+      <w:r>
+        <w:rPr>
+          <w:rtl w:val="0"/>
+        </w:rPr>
+        <w:t xml:space="preserve">    105,          -- Результат первого тестового замера сварки/тока</w:t>
+      </w:r>
+    </w:p>
+    <w:p>
+      <w:pPr>
+        <w:rPr/>
+      </w:pPr>
+      <w:r>
+        <w:rPr>
+          <w:rtl w:val="0"/>
+        </w:rPr>
+        <w:t xml:space="preserve">    104,          -- Результат второго замера</w:t>
+      </w:r>
+    </w:p>
+    <w:p>
+      <w:pPr>
+        <w:rPr/>
+      </w:pPr>
+      <w:r>
+        <w:rPr>
+          <w:rtl w:val="0"/>
+        </w:rPr>
+        <w:t xml:space="preserve">    106,          -- Результат третьего замера</w:t>
+      </w:r>
+    </w:p>
+    <w:p>
+      <w:pPr>
+        <w:rPr/>
+      </w:pPr>
+      <w:r>
+        <w:rPr>
+          <w:rtl w:val="0"/>
+        </w:rPr>
+        <w:t xml:space="preserve">    280,          -- Замер давления 1 (например, в кгс или даН)</w:t>
+      </w:r>
+    </w:p>
+    <w:p>
+      <w:pPr>
+        <w:rPr/>
+      </w:pPr>
+      <w:r>
+        <w:rPr>
+          <w:rtl w:val="0"/>
+        </w:rPr>
+        <w:t xml:space="preserve">    278,          -- Замер давления 2</w:t>
+      </w:r>
+    </w:p>
+    <w:p>
+      <w:pPr>
+        <w:rPr/>
+      </w:pPr>
+      <w:r>
+        <w:rPr>
+          <w:rtl w:val="0"/>
+        </w:rPr>
+        <w:t xml:space="preserve">    281,          -- Замер давления 3</w:t>
+      </w:r>
+    </w:p>
+    <w:p>
+      <w:pPr>
+        <w:rPr/>
+      </w:pPr>
+      <w:r>
+        <w:rPr>
+          <w:rtl w:val="0"/>
+        </w:rPr>
+        <w:t xml:space="preserve">    '2026-05-15', -- Дата проведения обслуживания</w:t>
+      </w:r>
+    </w:p>
+    <w:p>
+      <w:pPr>
+        <w:rPr/>
+      </w:pPr>
+      <w:r>
+        <w:rPr>
+          <w:rtl w:val="0"/>
+        </w:rPr>
+        <w:t xml:space="preserve">    1,            -- ID работника, проводившего ТО (например, Таңатов Айбар)</w:t>
+      </w:r>
+    </w:p>
+    <w:p>
+      <w:pPr>
+        <w:rPr/>
+      </w:pPr>
+      <w:r>
+        <w:rPr>
+          <w:rtl w:val="0"/>
+        </w:rPr>
+        <w:t xml:space="preserve">    3             -- ID обслуженных клещей</w:t>
+      </w:r>
+    </w:p>
+    <w:p>
+      <w:pPr>
+        <w:rPr/>
+      </w:pPr>
+      <w:r>
+        <w:rPr>
+          <w:rtl w:val="0"/>
+        </w:rPr>
+        <w:t xml:space="preserve">);</w:t>
+      </w:r>
+    </w:p>
+    <w:p>
+      <w:pPr>
+        <w:rPr/>
+      </w:pPr>
+      <w:r>
+        <w:rPr>
+          <w:rtl w:val="0"/>
+        </w:rPr>
+      </w:r>
+    </w:p>
+    <w:p>
+      <w:pPr>
+        <w:rPr/>
+      </w:pPr>
+      <w:r>
+        <w:rPr>
+          <w:rtl w:val="0"/>
+        </w:rPr>
+        <w:t xml:space="preserve">COMMIT;</w:t>
+      </w:r>
+    </w:p>
+    <w:p>
+      <w:pPr>
+        <w:ind w:left="0" w:firstLine="0"/>
+        <w:jc w:val="left"/>
+        <w:rPr>
+          <w:b w:val="1"/>
+          <w:bCs w:val="1"/>
+        </w:rPr>
+      </w:pPr>
+      <w:r>
+        <w:rPr>
+          <w:rtl w:val="0"/>
+        </w:rPr>
       </w:r>
     </w:p>
     <w:p>
@@ -173,34 +2883,155 @@
         <w:ind w:left="720" w:hanging="360"/>
         <w:jc w:val="left"/>
         <w:rPr>
-          <w:u w:val="none"/>
-        </w:rPr>
-      </w:pPr>
-      <w:r>
-        <w:rPr>
-          <w:rtl w:val="0"/>
-        </w:rPr>
-        <w:t xml:space="preserve">Удаление дефекта</w:t>
+          <w:b w:val="1"/>
+          <w:bCs w:val="1"/>
+        </w:rPr>
+      </w:pPr>
+      <w:r>
+        <w:rPr>
+          <w:b w:val="1"/>
+          <w:bCs w:val="1"/>
+          <w:rtl w:val="0"/>
+        </w:rPr>
+        <w:t xml:space="preserve">Удаление ТО гана</w:t>
+      </w:r>
+    </w:p>
+    <w:p>
+      <w:pPr>
+        <w:ind w:left="720" w:firstLine="0"/>
+        <w:jc w:val="left"/>
+        <w:rPr>
+          <w:b w:val="1"/>
+          <w:bCs w:val="1"/>
+        </w:rPr>
+      </w:pPr>
+      <w:r>
+        <w:rPr>
+          <w:rtl w:val="0"/>
+        </w:rPr>
+      </w:r>
+    </w:p>
+    <w:p>
+      <w:pPr>
+        <w:rPr/>
+      </w:pPr>
+      <w:r>
+        <w:rPr>
+          <w:rtl w:val="0"/>
+        </w:rPr>
+        <w:t xml:space="preserve">BEGIN TRANSACTION;</w:t>
+      </w:r>
+    </w:p>
+    <w:p>
+      <w:pPr>
+        <w:rPr/>
+      </w:pPr>
+      <w:r>
+        <w:rPr>
+          <w:rtl w:val="0"/>
+        </w:rPr>
+      </w:r>
+    </w:p>
+    <w:p>
+      <w:pPr>
+        <w:rPr/>
+      </w:pPr>
+      <w:r>
+        <w:rPr>
+          <w:rtl w:val="0"/>
+        </w:rPr>
+        <w:t xml:space="preserve">-- Удаляем запись по номеру клещей и дате обслуживания</w:t>
+      </w:r>
+    </w:p>
+    <w:p>
+      <w:pPr>
+        <w:rPr/>
+      </w:pPr>
+      <w:r>
+        <w:rPr>
+          <w:rtl w:val="0"/>
+        </w:rPr>
+        <w:t xml:space="preserve">DELETE FROM maintenance </w:t>
+      </w:r>
+    </w:p>
+    <w:p>
+      <w:pPr>
+        <w:rPr/>
+      </w:pPr>
+      <w:r>
+        <w:rPr>
+          <w:rtl w:val="0"/>
+        </w:rPr>
+        <w:t xml:space="preserve">WHERE gun_id = 3 </w:t>
+      </w:r>
+    </w:p>
+    <w:p>
+      <w:pPr>
+        <w:rPr/>
+      </w:pPr>
+      <w:r>
+        <w:rPr>
+          <w:rtl w:val="0"/>
+        </w:rPr>
+        <w:t xml:space="preserve">  AND to_date = '2026-05-15';</w:t>
+      </w:r>
+    </w:p>
+    <w:p>
+      <w:pPr>
+        <w:rPr/>
+      </w:pPr>
+      <w:r>
+        <w:rPr>
+          <w:rtl w:val="0"/>
+        </w:rPr>
+      </w:r>
+    </w:p>
+    <w:p>
+      <w:pPr>
+        <w:rPr/>
+      </w:pPr>
+      <w:r>
+        <w:rPr>
+          <w:rtl w:val="0"/>
+        </w:rPr>
+        <w:t xml:space="preserve">COMMIT;</w:t>
+      </w:r>
+    </w:p>
+    <w:p>
+      <w:pPr>
+        <w:ind w:left="0" w:firstLine="0"/>
+        <w:jc w:val="left"/>
+        <w:rPr>
+          <w:b w:val="1"/>
+          <w:bCs w:val="1"/>
+        </w:rPr>
+      </w:pPr>
+      <w:r>
+        <w:rPr>
+          <w:rtl w:val="0"/>
+        </w:rPr>
       </w:r>
     </w:p>
     <w:p>
       <w:pPr>
         <w:ind w:left="0" w:firstLine="0"/>
         <w:jc w:val="center"/>
-        <w:rPr/>
-      </w:pPr>
-      <w:r>
-        <w:rPr>
+        <w:rPr>
+          <w:b w:val="1"/>
+          <w:bCs w:val="1"/>
           <w:sz w:val="36"/>
           <w:szCs w:val="36"/>
-          <w:rtl w:val="0"/>
-        </w:rPr>
-        <w:t xml:space="preserve">ТО</w:t>
-      </w:r>
-      <w:r>
-        <w:rPr>
-          <w:rtl w:val="0"/>
-        </w:rPr>
+        </w:rPr>
+      </w:pPr>
+      <w:r>
+        <w:rPr>
+          <w:b w:val="1"/>
+          <w:bCs w:val="1"/>
+          <w:sz w:val="36"/>
+          <w:szCs w:val="36"/>
+          <w:rtl w:val="0"/>
+        </w:rPr>
+        <w:t xml:space="preserve">Трансформатор</w:t>
       </w:r>
     </w:p>
     <w:p>
@@ -212,14 +3043,62 @@
         <w:ind w:left="720" w:hanging="360"/>
         <w:jc w:val="left"/>
         <w:rPr>
-          <w:u w:val="none"/>
-        </w:rPr>
-      </w:pPr>
-      <w:r>
-        <w:rPr>
-          <w:rtl w:val="0"/>
-        </w:rPr>
-        <w:t xml:space="preserve">Создание ТО гана</w:t>
+          <w:b w:val="1"/>
+          <w:bCs w:val="1"/>
+        </w:rPr>
+      </w:pPr>
+      <w:r>
+        <w:rPr>
+          <w:b w:val="1"/>
+          <w:bCs w:val="1"/>
+          <w:rtl w:val="0"/>
+        </w:rPr>
+        <w:t xml:space="preserve">2Создание трансформатора</w:t>
+      </w:r>
+    </w:p>
+    <w:p>
+      <w:pPr>
+        <w:ind w:left="0" w:firstLine="0"/>
+        <w:jc w:val="left"/>
+        <w:rPr>
+          <w:b w:val="1"/>
+          <w:bCs w:val="1"/>
+        </w:rPr>
+      </w:pPr>
+      <w:r>
+        <w:rPr>
+          <w:rtl w:val="0"/>
+        </w:rPr>
+      </w:r>
+    </w:p>
+    <w:p>
+      <w:pPr>
+        <w:ind w:left="0" w:firstLine="0"/>
+        <w:jc w:val="left"/>
+        <w:rPr>
+          <w:b w:val="1"/>
+          <w:bCs w:val="1"/>
+        </w:rPr>
+      </w:pPr>
+      <w:r>
+        <w:rPr>
+          <w:rtl w:val="0"/>
+        </w:rPr>
+      </w:r>
+    </w:p>
+    <w:p>
+      <w:pPr>
+        <w:ind w:left="0" w:firstLine="0"/>
+        <w:jc w:val="left"/>
+        <w:rPr>
+          <w:b w:val="1"/>
+          <w:bCs w:val="1"/>
+        </w:rPr>
+      </w:pPr>
+      <w:r>
+        <w:rPr>
+          <w:rtl w:val="0"/>
+        </w:rPr>
       </w:r>
     </w:p>
     <w:p>
@@ -231,14 +3110,411 @@
         <w:ind w:left="720" w:hanging="360"/>
         <w:jc w:val="left"/>
         <w:rPr>
+          <w:b w:val="1"/>
+          <w:bCs w:val="1"/>
+        </w:rPr>
+      </w:pPr>
+      <w:r>
+        <w:rPr>
+          <w:b w:val="1"/>
+          <w:bCs w:val="1"/>
+          <w:rtl w:val="0"/>
+        </w:rPr>
+        <w:t xml:space="preserve">Изменение значения end_date, is_active и comment</w:t>
+      </w:r>
+    </w:p>
+    <w:p>
+      <w:pPr>
+        <w:ind w:left="0" w:firstLine="0"/>
+        <w:jc w:val="left"/>
+        <w:rPr>
+          <w:b w:val="1"/>
+          <w:bCs w:val="1"/>
+        </w:rPr>
+      </w:pPr>
+      <w:r>
+        <w:rPr>
+          <w:rtl w:val="0"/>
+        </w:rPr>
+      </w:r>
+    </w:p>
+    <w:p>
+      <w:pPr>
+        <w:jc w:val="center"/>
+        <w:rPr>
+          <w:b w:val="1"/>
+          <w:bCs w:val="1"/>
+          <w:sz w:val="36"/>
+          <w:szCs w:val="36"/>
+        </w:rPr>
+      </w:pPr>
+      <w:r>
+        <w:rPr>
+          <w:b w:val="1"/>
+          <w:bCs w:val="1"/>
+          <w:sz w:val="36"/>
+          <w:szCs w:val="36"/>
+          <w:rtl w:val="0"/>
+        </w:rPr>
+        <w:t xml:space="preserve">Ган</w:t>
+      </w:r>
+    </w:p>
+    <w:p>
+      <w:pPr>
+        <w:jc w:val="center"/>
+        <w:rPr>
+          <w:b w:val="1"/>
+          <w:bCs w:val="1"/>
+          <w:sz w:val="36"/>
+          <w:szCs w:val="36"/>
+        </w:rPr>
+      </w:pPr>
+      <w:r>
+        <w:rPr>
+          <w:rtl w:val="0"/>
+        </w:rPr>
+      </w:r>
+    </w:p>
+    <w:p>
+      <w:pPr>
+        <w:ind w:left="0" w:firstLine="0"/>
+        <w:rPr>
+          <w:b w:val="1"/>
+          <w:bCs w:val="1"/>
+        </w:rPr>
+      </w:pPr>
+      <w:r>
+        <w:rPr>
+          <w:rtl w:val="0"/>
+        </w:rPr>
+      </w:r>
+    </w:p>
+    <w:p>
+      <w:pPr>
+        <w:numPr>
+          <w:ilvl w:val="0"/>
+          <w:numId w:val="3"/>
+        </w:numPr>
+        <w:ind w:left="720" w:hanging="360"/>
+        <w:rPr>
+          <w:b w:val="1"/>
+          <w:bCs w:val="1"/>
           <w:u w:val="none"/>
         </w:rPr>
       </w:pPr>
       <w:r>
         <w:rPr>
-          <w:rtl w:val="0"/>
-        </w:rPr>
-        <w:t xml:space="preserve">Удаление ТО гана</w:t>
+          <w:b w:val="1"/>
+          <w:bCs w:val="1"/>
+          <w:rtl w:val="0"/>
+        </w:rPr>
+        <w:t xml:space="preserve">Создание гана</w:t>
+      </w:r>
+    </w:p>
+    <w:p>
+      <w:pPr>
+        <w:rPr/>
+      </w:pPr>
+      <w:r>
+        <w:rPr>
+          <w:rtl w:val="0"/>
+        </w:rPr>
+        <w:t xml:space="preserve">INSERT INTO gun (</w:t>
+      </w:r>
+    </w:p>
+    <w:p>
+      <w:pPr>
+        <w:rPr/>
+      </w:pPr>
+      <w:r>
+        <w:rPr>
+          <w:rtl w:val="0"/>
+        </w:rPr>
+        <w:t xml:space="preserve">    g_num, </w:t>
+      </w:r>
+    </w:p>
+    <w:p>
+      <w:pPr>
+        <w:rPr/>
+      </w:pPr>
+      <w:r>
+        <w:rPr>
+          <w:rtl w:val="0"/>
+        </w:rPr>
+        <w:t xml:space="preserve">    model</w:t>
+      </w:r>
+    </w:p>
+    <w:p>
+      <w:pPr>
+        <w:rPr/>
+      </w:pPr>
+      <w:r>
+        <w:rPr>
+          <w:rtl w:val="0"/>
+        </w:rPr>
+        <w:t xml:space="preserve">) </w:t>
+      </w:r>
+    </w:p>
+    <w:p>
+      <w:pPr>
+        <w:rPr/>
+      </w:pPr>
+      <w:r>
+        <w:rPr>
+          <w:rtl w:val="0"/>
+        </w:rPr>
+        <w:t xml:space="preserve">VALUES (</w:t>
+      </w:r>
+    </w:p>
+    <w:p>
+      <w:pPr>
+        <w:rPr/>
+      </w:pPr>
+      <w:r>
+        <w:rPr>
+          <w:rtl w:val="0"/>
+        </w:rPr>
+        <w:t xml:space="preserve">    45,             -- Номер новых клещей (например, клещи №45)</w:t>
+      </w:r>
+    </w:p>
+    <w:p>
+      <w:pPr>
+        <w:rPr/>
+      </w:pPr>
+      <w:r>
+        <w:rPr>
+          <w:rtl w:val="0"/>
+        </w:rPr>
+        <w:t xml:space="preserve">    1  -- Модель клещей</w:t>
+      </w:r>
+    </w:p>
+    <w:p>
+      <w:pPr>
+        <w:rPr/>
+      </w:pPr>
+      <w:r>
+        <w:rPr>
+          <w:rtl w:val="0"/>
+        </w:rPr>
+        <w:t xml:space="preserve">);</w:t>
+      </w:r>
+    </w:p>
+    <w:p>
+      <w:pPr>
+        <w:rPr/>
+      </w:pPr>
+      <w:r>
+        <w:rPr>
+          <w:rtl w:val="0"/>
+        </w:rPr>
+      </w:r>
+    </w:p>
+    <w:p>
+      <w:pPr>
+        <w:rPr/>
+      </w:pPr>
+      <w:r>
+        <w:rPr>
+          <w:rtl w:val="0"/>
+        </w:rPr>
+        <w:t xml:space="preserve">INSERT INTO gun_transformer_sssignment ( -- В вашей базе таблица называется именно так, через 's'</w:t>
+      </w:r>
+    </w:p>
+    <w:p>
+      <w:pPr>
+        <w:rPr/>
+      </w:pPr>
+      <w:r>
+        <w:rPr>
+          <w:rtl w:val="0"/>
+        </w:rPr>
+        <w:t xml:space="preserve">    start_date, </w:t>
+      </w:r>
+    </w:p>
+    <w:p>
+      <w:pPr>
+        <w:rPr/>
+      </w:pPr>
+      <w:r>
+        <w:rPr>
+          <w:rtl w:val="0"/>
+        </w:rPr>
+        <w:t xml:space="preserve">    is_active, </w:t>
+      </w:r>
+    </w:p>
+    <w:p>
+      <w:pPr>
+        <w:rPr/>
+      </w:pPr>
+      <w:r>
+        <w:rPr>
+          <w:rtl w:val="0"/>
+        </w:rPr>
+        <w:t xml:space="preserve">    comments, </w:t>
+      </w:r>
+    </w:p>
+    <w:p>
+      <w:pPr>
+        <w:rPr/>
+      </w:pPr>
+      <w:r>
+        <w:rPr>
+          <w:rtl w:val="0"/>
+        </w:rPr>
+        <w:t xml:space="preserve">    gun_id, </w:t>
+      </w:r>
+    </w:p>
+    <w:p>
+      <w:pPr>
+        <w:rPr/>
+      </w:pPr>
+      <w:r>
+        <w:rPr>
+          <w:rtl w:val="0"/>
+        </w:rPr>
+        <w:t xml:space="preserve">    transformer_id</w:t>
+      </w:r>
+    </w:p>
+    <w:p>
+      <w:pPr>
+        <w:rPr/>
+      </w:pPr>
+      <w:r>
+        <w:rPr>
+          <w:rtl w:val="0"/>
+        </w:rPr>
+        <w:t xml:space="preserve">) </w:t>
+      </w:r>
+    </w:p>
+    <w:p>
+      <w:pPr>
+        <w:rPr/>
+      </w:pPr>
+      <w:r>
+        <w:rPr>
+          <w:rtl w:val="0"/>
+        </w:rPr>
+        <w:t xml:space="preserve">VALUES (</w:t>
+      </w:r>
+    </w:p>
+    <w:p>
+      <w:pPr>
+        <w:rPr/>
+      </w:pPr>
+      <w:r>
+        <w:rPr>
+          <w:rtl w:val="0"/>
+        </w:rPr>
+        <w:t xml:space="preserve">    '2026-05-15', </w:t>
+      </w:r>
+    </w:p>
+    <w:p>
+      <w:pPr>
+        <w:rPr/>
+      </w:pPr>
+      <w:r>
+        <w:rPr>
+          <w:rtl w:val="0"/>
+        </w:rPr>
+        <w:t xml:space="preserve">    1, </w:t>
+      </w:r>
+    </w:p>
+    <w:p>
+      <w:pPr>
+        <w:rPr/>
+      </w:pPr>
+      <w:r>
+        <w:rPr>
+          <w:rtl w:val="0"/>
+        </w:rPr>
+        <w:t xml:space="preserve">    'Ввод в эксплуатацию новых клещей', </w:t>
+      </w:r>
+    </w:p>
+    <w:p>
+      <w:pPr>
+        <w:rPr/>
+      </w:pPr>
+      <w:r>
+        <w:rPr>
+          <w:rtl w:val="0"/>
+        </w:rPr>
+        <w:t xml:space="preserve">    last_insert_rowid(),  -- Подхватываем ID только что созданных клещей</w:t>
+      </w:r>
+    </w:p>
+    <w:p>
+      <w:pPr>
+        <w:rPr/>
+      </w:pPr>
+      <w:r>
+        <w:rPr>
+          <w:rtl w:val="0"/>
+        </w:rPr>
+        <w:t xml:space="preserve">    12                    -- ID трансформатора, к которому они подключаются</w:t>
+      </w:r>
+    </w:p>
+    <w:p>
+      <w:pPr>
+        <w:rPr/>
+      </w:pPr>
+      <w:r>
+        <w:rPr>
+          <w:rtl w:val="0"/>
+        </w:rPr>
+        <w:t xml:space="preserve">);</w:t>
+      </w:r>
+    </w:p>
+    <w:p>
+      <w:pPr>
+        <w:ind w:left="0" w:firstLine="0"/>
+        <w:rPr>
+          <w:b w:val="1"/>
+          <w:bCs w:val="1"/>
+        </w:rPr>
+      </w:pPr>
+      <w:r>
+        <w:rPr>
+          <w:rtl w:val="0"/>
+        </w:rPr>
+      </w:r>
+    </w:p>
+    <w:p>
+      <w:pPr>
+        <w:numPr>
+          <w:ilvl w:val="0"/>
+          <w:numId w:val="3"/>
+        </w:numPr>
+        <w:ind w:left="720" w:hanging="360"/>
+        <w:rPr>
+          <w:b w:val="1"/>
+          <w:bCs w:val="1"/>
+          <w:u w:val="none"/>
+        </w:rPr>
+      </w:pPr>
+      <w:r>
+        <w:rPr>
+          <w:rtl w:val="0"/>
+        </w:rPr>
+      </w:r>
+    </w:p>
+    <w:p>
+      <w:pPr>
+        <w:numPr>
+          <w:ilvl w:val="0"/>
+          <w:numId w:val="5"/>
+        </w:numPr>
+        <w:ind w:left="720" w:hanging="360"/>
+        <w:rPr>
+          <w:b w:val="1"/>
+          <w:bCs w:val="1"/>
+        </w:rPr>
+      </w:pPr>
+      <w:r>
+        <w:rPr>
+          <w:b w:val="1"/>
+          <w:bCs w:val="1"/>
+          <w:rtl w:val="0"/>
+        </w:rPr>
+        <w:t xml:space="preserve">Деактивирование гана путем задания  значения end_date, is_active и comment</w:t>
       </w:r>
     </w:p>
     <w:p>
@@ -246,71 +3522,34 @@
         <w:ind w:left="0" w:firstLine="0"/>
         <w:jc w:val="center"/>
         <w:rPr>
+          <w:b w:val="1"/>
+          <w:bCs w:val="1"/>
           <w:sz w:val="36"/>
           <w:szCs w:val="36"/>
         </w:rPr>
       </w:pPr>
       <w:r>
         <w:rPr>
+          <w:b w:val="1"/>
+          <w:bCs w:val="1"/>
           <w:sz w:val="36"/>
           <w:szCs w:val="36"/>
           <w:rtl w:val="0"/>
         </w:rPr>
-        <w:t xml:space="preserve">Трансформатор</w:t>
-      </w:r>
-    </w:p>
-    <w:p>
-      <w:pPr>
-        <w:numPr>
-          <w:ilvl w:val="0"/>
-          <w:numId w:val="4"/>
-        </w:numPr>
-        <w:ind w:left="720" w:hanging="360"/>
-        <w:jc w:val="left"/>
-        <w:rPr>
-          <w:u w:val="none"/>
-        </w:rPr>
-      </w:pPr>
-      <w:r>
-        <w:rPr>
-          <w:rtl w:val="0"/>
-        </w:rPr>
-        <w:t xml:space="preserve">Создание трансформатора</w:t>
-      </w:r>
-    </w:p>
-    <w:p>
-      <w:pPr>
-        <w:numPr>
-          <w:ilvl w:val="0"/>
-          <w:numId w:val="4"/>
-        </w:numPr>
-        <w:ind w:left="720" w:hanging="360"/>
-        <w:jc w:val="left"/>
-        <w:rPr>
-          <w:u w:val="none"/>
-        </w:rPr>
-      </w:pPr>
-      <w:r>
-        <w:rPr>
-          <w:rtl w:val="0"/>
-        </w:rPr>
-        <w:t xml:space="preserve">Изменение значения end_date, is_active и comment</w:t>
+        <w:t xml:space="preserve">Работник</w:t>
       </w:r>
     </w:p>
     <w:p>
       <w:pPr>
         <w:ind w:left="0" w:firstLine="0"/>
         <w:jc w:val="center"/>
-        <w:rPr/>
-      </w:pPr>
-      <w:r>
-        <w:rPr>
+        <w:rPr>
+          <w:b w:val="1"/>
+          <w:bCs w:val="1"/>
           <w:sz w:val="36"/>
           <w:szCs w:val="36"/>
-          <w:rtl w:val="0"/>
-        </w:rPr>
-        <w:t xml:space="preserve">Работник</w:t>
-      </w:r>
+        </w:rPr>
+      </w:pPr>
       <w:r>
         <w:rPr>
           <w:rtl w:val="0"/>
@@ -326,14 +3565,47 @@
         <w:ind w:left="720" w:hanging="360"/>
         <w:jc w:val="left"/>
         <w:rPr>
-          <w:u w:val="none"/>
-        </w:rPr>
-      </w:pPr>
-      <w:r>
-        <w:rPr>
+          <w:b w:val="1"/>
+          <w:bCs w:val="1"/>
+        </w:rPr>
+      </w:pPr>
+      <w:r>
+        <w:rPr>
+          <w:b w:val="1"/>
+          <w:bCs w:val="1"/>
           <w:rtl w:val="0"/>
         </w:rPr>
         <w:t xml:space="preserve">Создание работника</w:t>
+      </w:r>
+    </w:p>
+    <w:p>
+      <w:pPr>
+        <w:ind w:left="0" w:firstLine="0"/>
+        <w:jc w:val="left"/>
+        <w:rPr>
+          <w:b w:val="1"/>
+          <w:bCs w:val="1"/>
+        </w:rPr>
+      </w:pPr>
+      <w:r>
+        <w:rPr>
+          <w:rtl w:val="0"/>
+        </w:rPr>
+      </w:r>
+    </w:p>
+    <w:p>
+      <w:pPr>
+        <w:ind w:left="0" w:firstLine="0"/>
+        <w:jc w:val="left"/>
+        <w:rPr>
+          <w:b w:val="1"/>
+          <w:bCs w:val="1"/>
+        </w:rPr>
+      </w:pPr>
+      <w:r>
+        <w:rPr>
+          <w:rtl w:val="0"/>
+        </w:rPr>
       </w:r>
     </w:p>
     <w:p>
@@ -345,11 +3617,14 @@
         <w:ind w:left="720" w:hanging="360"/>
         <w:jc w:val="left"/>
         <w:rPr>
-          <w:u w:val="none"/>
-        </w:rPr>
-      </w:pPr>
-      <w:r>
-        <w:rPr>
+          <w:b w:val="1"/>
+          <w:bCs w:val="1"/>
+        </w:rPr>
+      </w:pPr>
+      <w:r>
+        <w:rPr>
+          <w:b w:val="1"/>
+          <w:bCs w:val="1"/>
           <w:rtl w:val="0"/>
         </w:rPr>
         <w:t xml:space="preserve">Изменение end_date работника</w:t>
@@ -917,6 +4192,116 @@
     </w:lvl>
   </w:abstractNum>
   <w:abstractNum w:abstractNumId="6">
+    <w:lvl w:ilvl="0">
+      <w:start w:val="1"/>
+      <w:numFmt w:val="decimal"/>
+      <w:lvlText w:val="%1."/>
+      <w:lvlJc w:val="left"/>
+      <w:pPr>
+        <w:ind w:left="720" w:hanging="360"/>
+      </w:pPr>
+      <w:rPr>
+        <w:u w:val="none"/>
+      </w:rPr>
+    </w:lvl>
+    <w:lvl w:ilvl="1">
+      <w:start w:val="1"/>
+      <w:numFmt w:val="lowerLetter"/>
+      <w:lvlText w:val="%2."/>
+      <w:lvlJc w:val="left"/>
+      <w:pPr>
+        <w:ind w:left="1440" w:hanging="360"/>
+      </w:pPr>
+      <w:rPr>
+        <w:u w:val="none"/>
+      </w:rPr>
+    </w:lvl>
+    <w:lvl w:ilvl="2">
+      <w:start w:val="1"/>
+      <w:numFmt w:val="lowerRoman"/>
+      <w:lvlText w:val="%3."/>
+      <w:lvlJc w:val="right"/>
+      <w:pPr>
+        <w:ind w:left="2160" w:hanging="360"/>
+      </w:pPr>
+      <w:rPr>
+        <w:u w:val="none"/>
+      </w:rPr>
+    </w:lvl>
+    <w:lvl w:ilvl="3">
+      <w:start w:val="1"/>
+      <w:numFmt w:val="decimal"/>
+      <w:lvlText w:val="%4."/>
+      <w:lvlJc w:val="left"/>
+      <w:pPr>
+        <w:ind w:left="2880" w:hanging="360"/>
+      </w:pPr>
+      <w:rPr>
+        <w:u w:val="none"/>
+      </w:rPr>
+    </w:lvl>
+    <w:lvl w:ilvl="4">
+      <w:start w:val="1"/>
+      <w:numFmt w:val="lowerLetter"/>
+      <w:lvlText w:val="%5."/>
+      <w:lvlJc w:val="left"/>
+      <w:pPr>
+        <w:ind w:left="3600" w:hanging="360"/>
+      </w:pPr>
+      <w:rPr>
+        <w:u w:val="none"/>
+      </w:rPr>
+    </w:lvl>
+    <w:lvl w:ilvl="5">
+      <w:start w:val="1"/>
+      <w:numFmt w:val="lowerRoman"/>
+      <w:lvlText w:val="%6."/>
+      <w:lvlJc w:val="right"/>
+      <w:pPr>
+        <w:ind w:left="4320" w:hanging="360"/>
+      </w:pPr>
+      <w:rPr>
+        <w:u w:val="none"/>
+      </w:rPr>
+    </w:lvl>
+    <w:lvl w:ilvl="6">
+      <w:start w:val="1"/>
+      <w:numFmt w:val="decimal"/>
+      <w:lvlText w:val="%7."/>
+      <w:lvlJc w:val="left"/>
+      <w:pPr>
+        <w:ind w:left="5040" w:hanging="360"/>
+      </w:pPr>
+      <w:rPr>
+        <w:u w:val="none"/>
+      </w:rPr>
+    </w:lvl>
+    <w:lvl w:ilvl="7">
+      <w:start w:val="1"/>
+      <w:numFmt w:val="lowerLetter"/>
+      <w:lvlText w:val="%8."/>
+      <w:lvlJc w:val="left"/>
+      <w:pPr>
+        <w:ind w:left="5760" w:hanging="360"/>
+      </w:pPr>
+      <w:rPr>
+        <w:u w:val="none"/>
+      </w:rPr>
+    </w:lvl>
+    <w:lvl w:ilvl="8">
+      <w:start w:val="1"/>
+      <w:numFmt w:val="lowerRoman"/>
+      <w:lvlText w:val="%9."/>
+      <w:lvlJc w:val="right"/>
+      <w:pPr>
+        <w:ind w:left="6480" w:hanging="360"/>
+      </w:pPr>
+      <w:rPr>
+        <w:u w:val="none"/>
+      </w:rPr>
+    </w:lvl>
+  </w:abstractNum>
+  <w:abstractNum w:abstractNumId="7">
     <w:lvl w:ilvl="0">
       <w:start w:val="1"/>
       <w:numFmt w:val="decimal"/>
@@ -1043,6 +4428,9 @@
   </w:num>
   <w:num w:numId="6">
     <w:abstractNumId w:val="6"/>
+  </w:num>
+  <w:num w:numId="7">
+    <w:abstractNumId w:val="7"/>
   </w:num>
 </w:numbering>
 </file>

</xml_diff>